<commit_message>
deployed my first contract Yoohoo!
</commit_message>
<xml_diff>
--- a/Solidity.docx
+++ b/Solidity.docx
@@ -656,30 +656,14 @@
           <w:color w:val="A2A3BD"/>
           <w:szCs w:val="16"/>
         </w:rPr>
-        <w:t xml:space="preserve"> </w:t>
-      </w:r>
-      <w:proofErr w:type="gramStart"/>
-      <w:r>
-        <w:rPr>
-          <w:color w:val="A2A3BD"/>
-          <w:szCs w:val="16"/>
-        </w:rPr>
-        <w:t>getter</w:t>
-      </w:r>
-      <w:r>
-        <w:rPr>
-          <w:color w:val="DCDCDC"/>
-          <w:szCs w:val="16"/>
-        </w:rPr>
-        <w:t>(</w:t>
-      </w:r>
-      <w:proofErr w:type="gramEnd"/>
-      <w:r>
-        <w:rPr>
-          <w:color w:val="DCDCDC"/>
-          <w:szCs w:val="16"/>
-        </w:rPr>
-        <w:t>)</w:t>
+        <w:t xml:space="preserve"> getter</w:t>
+      </w:r>
+      <w:r>
+        <w:rPr>
+          <w:color w:val="DCDCDC"/>
+          <w:szCs w:val="16"/>
+        </w:rPr>
+        <w:t>()</w:t>
       </w:r>
       <w:r>
         <w:rPr>
@@ -874,18 +858,10 @@
         <w:t>getter;</w:t>
       </w:r>
       <w:r>
-        <w:t xml:space="preserve"> deployment is 1 Tx and using the setter is 1 Tx. </w:t>
-      </w:r>
-      <w:proofErr w:type="gramStart"/>
-      <w:r>
-        <w:t>Getter</w:t>
-      </w:r>
-      <w:r>
-        <w:t>(</w:t>
-      </w:r>
-      <w:proofErr w:type="gramEnd"/>
-      <w:r>
-        <w:t>)</w:t>
+        <w:t xml:space="preserve"> deployment is 1 Tx and using the setter is 1 Tx. Getter</w:t>
+      </w:r>
+      <w:r>
+        <w:t>()</w:t>
       </w:r>
       <w:r>
         <w:t xml:space="preserve"> is public view.</w:t>
@@ -1622,7 +1598,6 @@
         <w:t xml:space="preserve"> </w:t>
       </w:r>
       <w:proofErr w:type="spellStart"/>
-      <w:proofErr w:type="gramStart"/>
       <w:r>
         <w:t>doMath</w:t>
       </w:r>
@@ -1634,7 +1609,6 @@
         <w:t>(</w:t>
       </w:r>
       <w:proofErr w:type="spellStart"/>
-      <w:proofErr w:type="gramEnd"/>
       <w:r>
         <w:rPr>
           <w:color w:val="569CD6"/>
@@ -3074,6 +3048,89 @@
       <w:proofErr w:type="spellEnd"/>
       <w:r>
         <w:t xml:space="preserve"> variables, they must first be loaded into memory.</w:t>
+      </w:r>
+    </w:p>
+    <w:p>
+      <w:r>
+        <w:t xml:space="preserve">And </w:t>
+      </w:r>
+      <w:proofErr w:type="gramStart"/>
+      <w:r>
+        <w:t>finally</w:t>
+      </w:r>
+      <w:proofErr w:type="gramEnd"/>
+      <w:r>
+        <w:t xml:space="preserve"> I deployed my first contract in a real </w:t>
+      </w:r>
+      <w:proofErr w:type="spellStart"/>
+      <w:r>
+        <w:t>testnet</w:t>
+      </w:r>
+      <w:proofErr w:type="spellEnd"/>
+      <w:r>
+        <w:t xml:space="preserve"> blockchain: Yoohoo!</w:t>
+      </w:r>
+    </w:p>
+    <w:p>
+      <w:r>
+        <w:rPr>
+          <w:noProof/>
+        </w:rPr>
+        <w:lastRenderedPageBreak/>
+        <w:drawing>
+          <wp:inline distT="0" distB="0" distL="0" distR="0" wp14:anchorId="0FCD8D08" wp14:editId="53DFDC82">
+            <wp:extent cx="5943600" cy="1964690"/>
+            <wp:effectExtent l="190500" t="190500" r="190500" b="187960"/>
+            <wp:docPr id="889128970" name="Picture 2"/>
+            <wp:cNvGraphicFramePr>
+              <a:graphicFrameLocks xmlns:a="http://schemas.openxmlformats.org/drawingml/2006/main" noChangeAspect="1"/>
+            </wp:cNvGraphicFramePr>
+            <a:graphic xmlns:a="http://schemas.openxmlformats.org/drawingml/2006/main">
+              <a:graphicData uri="http://schemas.openxmlformats.org/drawingml/2006/picture">
+                <pic:pic xmlns:pic="http://schemas.openxmlformats.org/drawingml/2006/picture">
+                  <pic:nvPicPr>
+                    <pic:cNvPr id="0" name="Picture 1"/>
+                    <pic:cNvPicPr>
+                      <a:picLocks noChangeAspect="1" noChangeArrowheads="1"/>
+                    </pic:cNvPicPr>
+                  </pic:nvPicPr>
+                  <pic:blipFill>
+                    <a:blip r:embed="rId36" cstate="print">
+                      <a:extLst>
+                        <a:ext uri="{28A0092B-C50C-407E-A947-70E740481C1C}">
+                          <a14:useLocalDpi xmlns:a14="http://schemas.microsoft.com/office/drawing/2010/main" val="0"/>
+                        </a:ext>
+                      </a:extLst>
+                    </a:blip>
+                    <a:srcRect/>
+                    <a:stretch>
+                      <a:fillRect/>
+                    </a:stretch>
+                  </pic:blipFill>
+                  <pic:spPr bwMode="auto">
+                    <a:xfrm>
+                      <a:off x="0" y="0"/>
+                      <a:ext cx="5943600" cy="1964690"/>
+                    </a:xfrm>
+                    <a:prstGeom prst="rect">
+                      <a:avLst/>
+                    </a:prstGeom>
+                    <a:ln>
+                      <a:noFill/>
+                    </a:ln>
+                    <a:effectLst>
+                      <a:outerShdw blurRad="190500" algn="tl" rotWithShape="0">
+                        <a:srgbClr val="000000">
+                          <a:alpha val="70000"/>
+                        </a:srgbClr>
+                      </a:outerShdw>
+                    </a:effectLst>
+                  </pic:spPr>
+                </pic:pic>
+              </a:graphicData>
+            </a:graphic>
+          </wp:inline>
+        </w:drawing>
       </w:r>
     </w:p>
     <w:p/>
@@ -3853,6 +3910,7 @@
   <w:style w:type="character" w:default="1" w:styleId="DefaultParagraphFont">
     <w:name w:val="Default Paragraph Font"/>
     <w:uiPriority w:val="1"/>
+    <w:semiHidden/>
     <w:unhideWhenUsed/>
   </w:style>
   <w:style w:type="table" w:default="1" w:styleId="TableNormal">
@@ -4270,7 +4328,7 @@
     </inkml:brush>
   </inkml:definitions>
   <inkml:trace contextRef="#ctx0" brushRef="#br0">3600 630 24575,'-1'3'0,"-1"0"0,1-1 0,-1 1 0,0 0 0,0-1 0,0 1 0,0-1 0,0 0 0,-1 0 0,1 0 0,-1 0 0,1 0 0,-1 0 0,0-1 0,-4 3 0,4-3 0,-21 12 0,-1-1 0,0-1 0,-1-2 0,0-1 0,-47 10 0,9-8 0,-85 3 0,78-10 0,12-2 0,1 3 0,-88 17 0,87-9 0,0-3 0,-81 2 0,-122-12 0,100-2 0,-217 5 0,-428-4 0,734-3 0,1-3 0,-118-30 0,95 18 0,48 11 0,19 4 0,0-1 0,0-1 0,1-1 0,-45-20 0,10 0 0,37 19 0,1-2 0,-39-24 0,56 30 0,1 1 0,0-1 0,1 0 0,-1 0 0,1-1 0,0 0 0,0 0 0,1 0 0,-1 0 0,1-1 0,1 1 0,-1-1 0,-4-14 0,-7-21 0,11 35 0,1-1 0,0 0 0,0 0 0,1 0 0,0 0 0,0-1 0,1 1 0,0-12 0,1 14 0,1 0 0,-1 0 0,1 0 0,1 1 0,-1-1 0,1 0 0,0 1 0,0-1 0,1 1 0,0-1 0,0 1 0,0 0 0,0 0 0,1 0 0,0 1 0,0-1 0,0 1 0,7-6 0,3 0 0,1 1 0,-1 0 0,1 1 0,1 1 0,21-8 0,38-9 0,1 4 0,101-15 0,-74 16 0,202-37 0,-214 41 0,1 5 0,176 1 0,1 1 0,781-14 0,-715 24 0,-314-2 0,295 6 0,-236 0 0,150 29 0,-139-16 0,85 23 0,-170-40 0,-1 0 0,1 0 0,0 1 0,-1 0 0,0 0 0,0 0 0,0 0 0,0 1 0,0 0 0,7 8 0,-9-8 0,-1-1 0,0 1 0,0 0 0,0-1 0,0 1 0,0 0 0,-1 0 0,0 0 0,0 0 0,0 0 0,0 0 0,-1 1 0,1-1 0,-1 0 0,0 0 0,-1 5 0,-1 19 0,2-14 0,-2 1 0,1-1 0,-2 1 0,-4 16 0,4-26 0,1 0 0,0 1 0,-1-1 0,0 0 0,0 0 0,-1 0 0,1-1 0,-1 1 0,0-1 0,-1 0 0,1 0 0,0 0 0,-1-1 0,-5 4 0,-81 46 0,51-31 0,1 2 0,-48 38 0,72-50-227,-1-2-1,0 1 1,-1-2-1,0 0 1,-27 9-1,35-15-6598</inkml:trace>
-  <inkml:trace contextRef="#ctx0" brushRef="#br0" timeOffset="624.33">4322 236 24575,'4'2'0,"0"3"0,3 5 0,0 3 0,-1 3 0,-2 1 0,0 3 0,-1 1 0,-1-4 0,-1 0 0,0-1 0,-1-2 0,0-3-8191</inkml:trace>
+  <inkml:trace contextRef="#ctx0" brushRef="#br0" timeOffset="624.31">4322 236 24575,'4'2'0,"0"3"0,3 5 0,0 3 0,-1 3 0,-2 1 0,0 3 0,-1 1 0,-1-4 0,-1 0 0,0-1 0,-1-2 0,0-3-8191</inkml:trace>
   <inkml:trace contextRef="#ctx0" brushRef="#br0" timeOffset="1417.35">4420 172 24575,'0'-2'0,"-3"0"0,-3 1 0,-6 1 0,-2 1 0,-3 3 0,1 1 0,-1 3 0,0 0 0,2 0 0,1-2 0,1-2 0,2-1 0,0 1 0,3 1 0,2 0-8191</inkml:trace>
   <inkml:trace contextRef="#ctx0" brushRef="#br0" timeOffset="2229.31">4534 284 24575,'0'2'0,"0"0"0,0 4 0,-3 3 0,-2 5 0,-2 1 0,1 3 0,0-1 0,-1-1 0,0-2 0,-1-1 0,2-3-8191</inkml:trace>
   <inkml:trace contextRef="#ctx0" brushRef="#br0" timeOffset="3145.92">4454 312 24575,'1'2'0,"2"3"0,3 2 0,1 4 0,3 3 0,3-2 0,-1 0 0,-1-1 0,-1-2 0,0-1 0,0-3 0,-1 1 0,0 0 0,-2-1-8191</inkml:trace>

</xml_diff>

<commit_message>
Learned oracles today. Cool stuff
</commit_message>
<xml_diff>
--- a/Solidity.docx
+++ b/Solidity.docx
@@ -2714,7 +2714,15 @@
       </w:pPr>
     </w:p>
     <w:p>
-      <w:r>
+      <w:pPr>
+        <w:rPr>
+          <w:color w:val="EE0000"/>
+        </w:rPr>
+      </w:pPr>
+      <w:r>
+        <w:rPr>
+          <w:color w:val="EE0000"/>
+        </w:rPr>
         <w:t>Calldata and Memory</w:t>
       </w:r>
     </w:p>
@@ -2753,7 +2761,7 @@
       <w:r>
         <w:lastRenderedPageBreak/>
         <w:drawing>
-          <wp:inline distT="0" distB="0" distL="0" distR="0" wp14:anchorId="0FCD8D08" wp14:editId="3D59D8D4">
+          <wp:inline distT="0" distB="0" distL="0" distR="0" wp14:anchorId="0FCD8D08" wp14:editId="70BBA6DE">
             <wp:extent cx="5440293" cy="1798320"/>
             <wp:effectExtent l="190500" t="190500" r="198755" b="182880"/>
             <wp:docPr id="889128970" name="Picture 2"/>
@@ -4977,14 +4985,7 @@
           <w:b/>
           <w:bCs/>
         </w:rPr>
-        <w:t>address</w:t>
-      </w:r>
-      <w:r>
-        <w:rPr>
-          <w:b/>
-          <w:bCs/>
-        </w:rPr>
-        <w:t xml:space="preserve"> </w:t>
+        <w:t xml:space="preserve">address </w:t>
       </w:r>
       <w:r>
         <w:rPr>
@@ -5016,10 +5017,7 @@
         <w:t>ABI (Application Binary Interface)</w:t>
       </w:r>
       <w:r>
-        <w:t>: a standardized way for interacting with the binary version of a smart contract deployed on the blockchain. It specifies the functions, their parameters, and the structure of the data that can be used to interact with the contract. It's generated by the compiler.</w:t>
-      </w:r>
-      <w:r>
-        <w:t xml:space="preserve"> </w:t>
+        <w:t xml:space="preserve">: a standardized way for interacting with the binary version of a smart contract deployed on the blockchain. It specifies the functions, their parameters, and the structure of the data that can be used to interact with the contract. It's generated by the compiler. </w:t>
       </w:r>
       <w:r>
         <w:rPr>
@@ -5144,13 +5142,7 @@
         <w:rPr>
           <w:rStyle w:val="codesnippetChar"/>
         </w:rPr>
-        <w:t>T</w:t>
-      </w:r>
-      <w:r>
-        <w:rPr>
-          <w:rStyle w:val="codesnippetChar"/>
-        </w:rPr>
-        <w:t>ypeError: Overriding function is missing "override" specifier.</w:t>
+        <w:t>TypeError: Overriding function is missing "override" specifier.</w:t>
       </w:r>
       <w:r>
         <w:rPr>
@@ -6272,6 +6264,1949 @@
       </w:r>
       <w:r>
         <w:t>The operations after the require won’t happen and won’t spend gas.</w:t>
+      </w:r>
+    </w:p>
+    <w:p>
+      <w:r>
+        <w:t>A point about reverts in EVM:</w:t>
+      </w:r>
+    </w:p>
+    <w:p>
+      <w:pPr>
+        <w:rPr>
+          <w:color w:val="EE0000"/>
+          <w:u w:val="single"/>
+        </w:rPr>
+      </w:pPr>
+      <w:r>
+        <w:rPr>
+          <w:b/>
+          <w:bCs/>
+          <w:u w:val="single"/>
+        </w:rPr>
+        <w:t>Key point:</w:t>
+      </w:r>
+      <w:r>
+        <w:rPr>
+          <w:u w:val="single"/>
+        </w:rPr>
+        <w:t xml:space="preserve"> The EVM does </w:t>
+      </w:r>
+      <w:r>
+        <w:rPr>
+          <w:b/>
+          <w:bCs/>
+          <w:u w:val="single"/>
+        </w:rPr>
+        <w:t>not</w:t>
+      </w:r>
+      <w:r>
+        <w:rPr>
+          <w:u w:val="single"/>
+        </w:rPr>
+        <w:t xml:space="preserve"> first commit the changes and then undo them. It executes against a temporary state snapshot. If execution succeeds, </w:t>
+      </w:r>
+      <w:r>
+        <w:rPr>
+          <w:color w:val="EE0000"/>
+          <w:u w:val="single"/>
+        </w:rPr>
+        <w:t>the snapshot is committed</w:t>
+      </w:r>
+      <w:r>
+        <w:rPr>
+          <w:u w:val="single"/>
+        </w:rPr>
+        <w:t xml:space="preserve">. If it reverts, the snapshot is simply discarded—all within the processing of that </w:t>
+      </w:r>
+      <w:r>
+        <w:rPr>
+          <w:b/>
+          <w:bCs/>
+          <w:u w:val="single"/>
+        </w:rPr>
+        <w:t xml:space="preserve">single transaction </w:t>
+      </w:r>
+      <w:r>
+        <w:rPr>
+          <w:b/>
+          <w:bCs/>
+          <w:color w:val="EE0000"/>
+          <w:u w:val="single"/>
+        </w:rPr>
+        <w:t>in the same block</w:t>
+      </w:r>
+      <w:r>
+        <w:rPr>
+          <w:color w:val="EE0000"/>
+          <w:u w:val="single"/>
+        </w:rPr>
+        <w:t>.</w:t>
+      </w:r>
+    </w:p>
+    <w:p>
+      <w:pPr>
+        <w:pStyle w:val="Heading2"/>
+      </w:pPr>
+      <w:r>
+        <w:lastRenderedPageBreak/>
+        <w:t>Oracles</w:t>
+      </w:r>
+    </w:p>
+    <w:p>
+      <w:pPr>
+        <w:jc w:val="center"/>
+      </w:pPr>
+      <w:r>
+        <w:drawing>
+          <wp:inline distT="0" distB="0" distL="0" distR="0" wp14:anchorId="0410431C" wp14:editId="606B65D1">
+            <wp:extent cx="5386597" cy="2770414"/>
+            <wp:effectExtent l="190500" t="190500" r="195580" b="182880"/>
+            <wp:docPr id="1379130804" name="Picture 1"/>
+            <wp:cNvGraphicFramePr>
+              <a:graphicFrameLocks xmlns:a="http://schemas.openxmlformats.org/drawingml/2006/main" noChangeAspect="1"/>
+            </wp:cNvGraphicFramePr>
+            <a:graphic xmlns:a="http://schemas.openxmlformats.org/drawingml/2006/main">
+              <a:graphicData uri="http://schemas.openxmlformats.org/drawingml/2006/picture">
+                <pic:pic xmlns:pic="http://schemas.openxmlformats.org/drawingml/2006/picture">
+                  <pic:nvPicPr>
+                    <pic:cNvPr id="1379130804" name=""/>
+                    <pic:cNvPicPr/>
+                  </pic:nvPicPr>
+                  <pic:blipFill>
+                    <a:blip r:embed="rId44"/>
+                    <a:stretch>
+                      <a:fillRect/>
+                    </a:stretch>
+                  </pic:blipFill>
+                  <pic:spPr>
+                    <a:xfrm>
+                      <a:off x="0" y="0"/>
+                      <a:ext cx="5407188" cy="2781004"/>
+                    </a:xfrm>
+                    <a:prstGeom prst="rect">
+                      <a:avLst/>
+                    </a:prstGeom>
+                    <a:ln>
+                      <a:noFill/>
+                    </a:ln>
+                    <a:effectLst>
+                      <a:outerShdw blurRad="190500" algn="tl" rotWithShape="0">
+                        <a:srgbClr val="000000">
+                          <a:alpha val="70000"/>
+                        </a:srgbClr>
+                      </a:outerShdw>
+                    </a:effectLst>
+                  </pic:spPr>
+                </pic:pic>
+              </a:graphicData>
+            </a:graphic>
+          </wp:inline>
+        </w:drawing>
+      </w:r>
+    </w:p>
+    <w:p>
+      <w:pPr>
+        <w:jc w:val="center"/>
+      </w:pPr>
+      <w:r>
+        <mc:AlternateContent>
+          <mc:Choice Requires="wpi">
+            <w:drawing>
+              <wp:anchor distT="0" distB="0" distL="114300" distR="114300" simplePos="0" relativeHeight="251801600" behindDoc="0" locked="0" layoutInCell="1" allowOverlap="1" wp14:anchorId="1601AF9B" wp14:editId="3A311FA7">
+                <wp:simplePos x="0" y="0"/>
+                <wp:positionH relativeFrom="column">
+                  <wp:posOffset>5002530</wp:posOffset>
+                </wp:positionH>
+                <wp:positionV relativeFrom="paragraph">
+                  <wp:posOffset>129540</wp:posOffset>
+                </wp:positionV>
+                <wp:extent cx="1224050" cy="434340"/>
+                <wp:effectExtent l="38100" t="38100" r="14605" b="41910"/>
+                <wp:wrapNone/>
+                <wp:docPr id="1074085054" name="Ink 63"/>
+                <wp:cNvGraphicFramePr/>
+                <a:graphic xmlns:a="http://schemas.openxmlformats.org/drawingml/2006/main">
+                  <a:graphicData uri="http://schemas.microsoft.com/office/word/2010/wordprocessingInk">
+                    <w14:contentPart bwMode="auto" r:id="rId45">
+                      <w14:nvContentPartPr>
+                        <w14:cNvContentPartPr/>
+                      </w14:nvContentPartPr>
+                      <w14:xfrm>
+                        <a:off x="0" y="0"/>
+                        <a:ext cx="1224050" cy="434340"/>
+                      </w14:xfrm>
+                    </w14:contentPart>
+                  </a:graphicData>
+                </a:graphic>
+              </wp:anchor>
+            </w:drawing>
+          </mc:Choice>
+          <mc:Fallback>
+            <w:pict>
+              <v:shapetype w14:anchorId="2859106D" id="_x0000_t75" coordsize="21600,21600" o:spt="75" o:preferrelative="t" path="m@4@5l@4@11@9@11@9@5xe" filled="f" stroked="f">
+                <v:stroke joinstyle="miter"/>
+                <v:formulas>
+                  <v:f eqn="if lineDrawn pixelLineWidth 0"/>
+                  <v:f eqn="sum @0 1 0"/>
+                  <v:f eqn="sum 0 0 @1"/>
+                  <v:f eqn="prod @2 1 2"/>
+                  <v:f eqn="prod @3 21600 pixelWidth"/>
+                  <v:f eqn="prod @3 21600 pixelHeight"/>
+                  <v:f eqn="sum @0 0 1"/>
+                  <v:f eqn="prod @6 1 2"/>
+                  <v:f eqn="prod @7 21600 pixelWidth"/>
+                  <v:f eqn="sum @8 21600 0"/>
+                  <v:f eqn="prod @7 21600 pixelHeight"/>
+                  <v:f eqn="sum @10 21600 0"/>
+                </v:formulas>
+                <v:path o:extrusionok="f" gradientshapeok="t" o:connecttype="rect"/>
+                <o:lock v:ext="edit" aspectratio="t"/>
+              </v:shapetype>
+              <v:shape id="Ink 63" o:spid="_x0000_s1026" type="#_x0000_t75" style="position:absolute;margin-left:393.55pt;margin-top:9.85pt;width:97.1pt;height:34.9pt;z-index:251801600;visibility:visible;mso-wrap-style:square;mso-wrap-distance-left:9pt;mso-wrap-distance-top:0;mso-wrap-distance-right:9pt;mso-wrap-distance-bottom:0;mso-position-horizontal:absolute;mso-position-horizontal-relative:text;mso-position-vertical:absolute;mso-position-vertical-relative:text" o:gfxdata="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">
+                <v:imagedata r:id="rId46" o:title=""/>
+              </v:shape>
+            </w:pict>
+          </mc:Fallback>
+        </mc:AlternateContent>
+      </w:r>
+      <w:r>
+        <mc:AlternateContent>
+          <mc:Choice Requires="wpi">
+            <w:drawing>
+              <wp:anchor distT="0" distB="0" distL="114300" distR="114300" simplePos="0" relativeHeight="251757568" behindDoc="0" locked="0" layoutInCell="1" allowOverlap="1" wp14:anchorId="649F8021" wp14:editId="681CDC6F">
+                <wp:simplePos x="0" y="0"/>
+                <wp:positionH relativeFrom="column">
+                  <wp:posOffset>5152503</wp:posOffset>
+                </wp:positionH>
+                <wp:positionV relativeFrom="paragraph">
+                  <wp:posOffset>589503</wp:posOffset>
+                </wp:positionV>
+                <wp:extent cx="85320" cy="137880"/>
+                <wp:effectExtent l="38100" t="38100" r="48260" b="33655"/>
+                <wp:wrapNone/>
+                <wp:docPr id="882581108" name="Ink 14"/>
+                <wp:cNvGraphicFramePr/>
+                <a:graphic xmlns:a="http://schemas.openxmlformats.org/drawingml/2006/main">
+                  <a:graphicData uri="http://schemas.microsoft.com/office/word/2010/wordprocessingInk">
+                    <w14:contentPart bwMode="auto" r:id="rId47">
+                      <w14:nvContentPartPr>
+                        <w14:cNvContentPartPr/>
+                      </w14:nvContentPartPr>
+                      <w14:xfrm>
+                        <a:off x="0" y="0"/>
+                        <a:ext cx="85320" cy="137880"/>
+                      </w14:xfrm>
+                    </w14:contentPart>
+                  </a:graphicData>
+                </a:graphic>
+              </wp:anchor>
+            </w:drawing>
+          </mc:Choice>
+          <mc:Fallback>
+            <w:pict>
+              <v:shape w14:anchorId="02F99F45" id="Ink 14" o:spid="_x0000_s1026" type="#_x0000_t75" style="position:absolute;margin-left:405.35pt;margin-top:46.05pt;width:7.4pt;height:11.55pt;z-index:251757568;visibility:visible;mso-wrap-style:square;mso-wrap-distance-left:9pt;mso-wrap-distance-top:0;mso-wrap-distance-right:9pt;mso-wrap-distance-bottom:0;mso-position-horizontal:absolute;mso-position-horizontal-relative:text;mso-position-vertical:absolute;mso-position-vertical-relative:text" o:gfxdata="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">
+                <v:imagedata r:id="rId48" o:title=""/>
+              </v:shape>
+            </w:pict>
+          </mc:Fallback>
+        </mc:AlternateContent>
+      </w:r>
+      <w:r>
+        <mc:AlternateContent>
+          <mc:Choice Requires="wpi">
+            <w:drawing>
+              <wp:anchor distT="0" distB="0" distL="114300" distR="114300" simplePos="0" relativeHeight="251756544" behindDoc="0" locked="0" layoutInCell="1" allowOverlap="1" wp14:anchorId="713848ED" wp14:editId="15A72100">
+                <wp:simplePos x="0" y="0"/>
+                <wp:positionH relativeFrom="column">
+                  <wp:posOffset>4678023</wp:posOffset>
+                </wp:positionH>
+                <wp:positionV relativeFrom="paragraph">
+                  <wp:posOffset>733503</wp:posOffset>
+                </wp:positionV>
+                <wp:extent cx="817200" cy="375120"/>
+                <wp:effectExtent l="38100" t="38100" r="40640" b="44450"/>
+                <wp:wrapNone/>
+                <wp:docPr id="1123816066" name="Ink 13"/>
+                <wp:cNvGraphicFramePr/>
+                <a:graphic xmlns:a="http://schemas.openxmlformats.org/drawingml/2006/main">
+                  <a:graphicData uri="http://schemas.microsoft.com/office/word/2010/wordprocessingInk">
+                    <w14:contentPart bwMode="auto" r:id="rId49">
+                      <w14:nvContentPartPr>
+                        <w14:cNvContentPartPr/>
+                      </w14:nvContentPartPr>
+                      <w14:xfrm>
+                        <a:off x="0" y="0"/>
+                        <a:ext cx="817200" cy="375120"/>
+                      </w14:xfrm>
+                    </w14:contentPart>
+                  </a:graphicData>
+                </a:graphic>
+              </wp:anchor>
+            </w:drawing>
+          </mc:Choice>
+          <mc:Fallback>
+            <w:pict>
+              <v:shape w14:anchorId="2545C08F" id="Ink 13" o:spid="_x0000_s1026" type="#_x0000_t75" style="position:absolute;margin-left:368pt;margin-top:57.4pt;width:65.1pt;height:30.25pt;z-index:251756544;visibility:visible;mso-wrap-style:square;mso-wrap-distance-left:9pt;mso-wrap-distance-top:0;mso-wrap-distance-right:9pt;mso-wrap-distance-bottom:0;mso-position-horizontal:absolute;mso-position-horizontal-relative:text;mso-position-vertical:absolute;mso-position-vertical-relative:text" o:gfxdata="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">
+                <v:imagedata r:id="rId50" o:title=""/>
+              </v:shape>
+            </w:pict>
+          </mc:Fallback>
+        </mc:AlternateContent>
+      </w:r>
+      <w:r>
+        <mc:AlternateContent>
+          <mc:Choice Requires="wpi">
+            <w:drawing>
+              <wp:anchor distT="0" distB="0" distL="114300" distR="114300" simplePos="0" relativeHeight="251755520" behindDoc="0" locked="0" layoutInCell="1" allowOverlap="1" wp14:anchorId="75839EF9" wp14:editId="21526C55">
+                <wp:simplePos x="0" y="0"/>
+                <wp:positionH relativeFrom="column">
+                  <wp:posOffset>1478343</wp:posOffset>
+                </wp:positionH>
+                <wp:positionV relativeFrom="paragraph">
+                  <wp:posOffset>1556823</wp:posOffset>
+                </wp:positionV>
+                <wp:extent cx="84240" cy="73800"/>
+                <wp:effectExtent l="38100" t="38100" r="49530" b="40640"/>
+                <wp:wrapNone/>
+                <wp:docPr id="367419043" name="Ink 12"/>
+                <wp:cNvGraphicFramePr/>
+                <a:graphic xmlns:a="http://schemas.openxmlformats.org/drawingml/2006/main">
+                  <a:graphicData uri="http://schemas.microsoft.com/office/word/2010/wordprocessingInk">
+                    <w14:contentPart bwMode="auto" r:id="rId51">
+                      <w14:nvContentPartPr>
+                        <w14:cNvContentPartPr/>
+                      </w14:nvContentPartPr>
+                      <w14:xfrm>
+                        <a:off x="0" y="0"/>
+                        <a:ext cx="84240" cy="73800"/>
+                      </w14:xfrm>
+                    </w14:contentPart>
+                  </a:graphicData>
+                </a:graphic>
+              </wp:anchor>
+            </w:drawing>
+          </mc:Choice>
+          <mc:Fallback>
+            <w:pict>
+              <v:shape w14:anchorId="23957186" id="Ink 12" o:spid="_x0000_s1026" type="#_x0000_t75" style="position:absolute;margin-left:116.05pt;margin-top:122.25pt;width:7.35pt;height:6.5pt;z-index:251755520;visibility:visible;mso-wrap-style:square;mso-wrap-distance-left:9pt;mso-wrap-distance-top:0;mso-wrap-distance-right:9pt;mso-wrap-distance-bottom:0;mso-position-horizontal:absolute;mso-position-horizontal-relative:text;mso-position-vertical:absolute;mso-position-vertical-relative:text" o:gfxdata="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">
+                <v:imagedata r:id="rId52" o:title=""/>
+              </v:shape>
+            </w:pict>
+          </mc:Fallback>
+        </mc:AlternateContent>
+      </w:r>
+      <w:r>
+        <mc:AlternateContent>
+          <mc:Choice Requires="wpi">
+            <w:drawing>
+              <wp:anchor distT="0" distB="0" distL="114300" distR="114300" simplePos="0" relativeHeight="251754496" behindDoc="0" locked="0" layoutInCell="1" allowOverlap="1" wp14:anchorId="235ABB37" wp14:editId="786FE4FF">
+                <wp:simplePos x="0" y="0"/>
+                <wp:positionH relativeFrom="column">
+                  <wp:posOffset>2550783</wp:posOffset>
+                </wp:positionH>
+                <wp:positionV relativeFrom="paragraph">
+                  <wp:posOffset>1367103</wp:posOffset>
+                </wp:positionV>
+                <wp:extent cx="96480" cy="125640"/>
+                <wp:effectExtent l="38100" t="38100" r="37465" b="46355"/>
+                <wp:wrapNone/>
+                <wp:docPr id="197789920" name="Ink 11"/>
+                <wp:cNvGraphicFramePr/>
+                <a:graphic xmlns:a="http://schemas.openxmlformats.org/drawingml/2006/main">
+                  <a:graphicData uri="http://schemas.microsoft.com/office/word/2010/wordprocessingInk">
+                    <w14:contentPart bwMode="auto" r:id="rId53">
+                      <w14:nvContentPartPr>
+                        <w14:cNvContentPartPr/>
+                      </w14:nvContentPartPr>
+                      <w14:xfrm>
+                        <a:off x="0" y="0"/>
+                        <a:ext cx="96480" cy="125640"/>
+                      </w14:xfrm>
+                    </w14:contentPart>
+                  </a:graphicData>
+                </a:graphic>
+              </wp:anchor>
+            </w:drawing>
+          </mc:Choice>
+          <mc:Fallback>
+            <w:pict>
+              <v:shape w14:anchorId="3DE3AACC" id="Ink 11" o:spid="_x0000_s1026" type="#_x0000_t75" style="position:absolute;margin-left:200.5pt;margin-top:107.3pt;width:8.35pt;height:10.6pt;z-index:251754496;visibility:visible;mso-wrap-style:square;mso-wrap-distance-left:9pt;mso-wrap-distance-top:0;mso-wrap-distance-right:9pt;mso-wrap-distance-bottom:0;mso-position-horizontal:absolute;mso-position-horizontal-relative:text;mso-position-vertical:absolute;mso-position-vertical-relative:text" o:gfxdata="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">
+                <v:imagedata r:id="rId54" o:title=""/>
+              </v:shape>
+            </w:pict>
+          </mc:Fallback>
+        </mc:AlternateContent>
+      </w:r>
+      <w:r>
+        <mc:AlternateContent>
+          <mc:Choice Requires="wpi">
+            <w:drawing>
+              <wp:anchor distT="0" distB="0" distL="114300" distR="114300" simplePos="0" relativeHeight="251753472" behindDoc="0" locked="0" layoutInCell="1" allowOverlap="1" wp14:anchorId="683447FC" wp14:editId="325AB43F">
+                <wp:simplePos x="0" y="0"/>
+                <wp:positionH relativeFrom="column">
+                  <wp:posOffset>2050023</wp:posOffset>
+                </wp:positionH>
+                <wp:positionV relativeFrom="paragraph">
+                  <wp:posOffset>616863</wp:posOffset>
+                </wp:positionV>
+                <wp:extent cx="95400" cy="96120"/>
+                <wp:effectExtent l="38100" t="38100" r="38100" b="37465"/>
+                <wp:wrapNone/>
+                <wp:docPr id="1989692683" name="Ink 10"/>
+                <wp:cNvGraphicFramePr/>
+                <a:graphic xmlns:a="http://schemas.openxmlformats.org/drawingml/2006/main">
+                  <a:graphicData uri="http://schemas.microsoft.com/office/word/2010/wordprocessingInk">
+                    <w14:contentPart bwMode="auto" r:id="rId55">
+                      <w14:nvContentPartPr>
+                        <w14:cNvContentPartPr/>
+                      </w14:nvContentPartPr>
+                      <w14:xfrm>
+                        <a:off x="0" y="0"/>
+                        <a:ext cx="95400" cy="96120"/>
+                      </w14:xfrm>
+                    </w14:contentPart>
+                  </a:graphicData>
+                </a:graphic>
+              </wp:anchor>
+            </w:drawing>
+          </mc:Choice>
+          <mc:Fallback>
+            <w:pict>
+              <v:shape w14:anchorId="19BFAA62" id="Ink 10" o:spid="_x0000_s1026" type="#_x0000_t75" style="position:absolute;margin-left:161.05pt;margin-top:48.2pt;width:8.2pt;height:8.25pt;z-index:251753472;visibility:visible;mso-wrap-style:square;mso-wrap-distance-left:9pt;mso-wrap-distance-top:0;mso-wrap-distance-right:9pt;mso-wrap-distance-bottom:0;mso-position-horizontal:absolute;mso-position-horizontal-relative:text;mso-position-vertical:absolute;mso-position-vertical-relative:text" o:gfxdata="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">
+                <v:imagedata r:id="rId56" o:title=""/>
+              </v:shape>
+            </w:pict>
+          </mc:Fallback>
+        </mc:AlternateContent>
+      </w:r>
+      <w:r>
+        <mc:AlternateContent>
+          <mc:Choice Requires="wpi">
+            <w:drawing>
+              <wp:anchor distT="0" distB="0" distL="114300" distR="114300" simplePos="0" relativeHeight="251752448" behindDoc="0" locked="0" layoutInCell="1" allowOverlap="1" wp14:anchorId="7A4BF244" wp14:editId="45107BCA">
+                <wp:simplePos x="0" y="0"/>
+                <wp:positionH relativeFrom="column">
+                  <wp:posOffset>4157980</wp:posOffset>
+                </wp:positionH>
+                <wp:positionV relativeFrom="paragraph">
+                  <wp:posOffset>2007870</wp:posOffset>
+                </wp:positionV>
+                <wp:extent cx="65160" cy="65405"/>
+                <wp:effectExtent l="38100" t="38100" r="49530" b="48895"/>
+                <wp:wrapNone/>
+                <wp:docPr id="1559657652" name="Ink 9"/>
+                <wp:cNvGraphicFramePr/>
+                <a:graphic xmlns:a="http://schemas.openxmlformats.org/drawingml/2006/main">
+                  <a:graphicData uri="http://schemas.microsoft.com/office/word/2010/wordprocessingInk">
+                    <w14:contentPart bwMode="auto" r:id="rId57">
+                      <w14:nvContentPartPr>
+                        <w14:cNvContentPartPr/>
+                      </w14:nvContentPartPr>
+                      <w14:xfrm>
+                        <a:off x="0" y="0"/>
+                        <a:ext cx="65160" cy="65405"/>
+                      </w14:xfrm>
+                    </w14:contentPart>
+                  </a:graphicData>
+                </a:graphic>
+              </wp:anchor>
+            </w:drawing>
+          </mc:Choice>
+          <mc:Fallback>
+            <w:pict>
+              <v:shape w14:anchorId="08BBCD49" id="Ink 9" o:spid="_x0000_s1026" type="#_x0000_t75" style="position:absolute;margin-left:327.05pt;margin-top:157.75pt;width:5.85pt;height:5.85pt;z-index:251752448;visibility:visible;mso-wrap-style:square;mso-wrap-distance-left:9pt;mso-wrap-distance-top:0;mso-wrap-distance-right:9pt;mso-wrap-distance-bottom:0;mso-position-horizontal:absolute;mso-position-horizontal-relative:text;mso-position-vertical:absolute;mso-position-vertical-relative:text" o:gfxdata="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">
+                <v:imagedata r:id="rId58" o:title=""/>
+              </v:shape>
+            </w:pict>
+          </mc:Fallback>
+        </mc:AlternateContent>
+      </w:r>
+      <w:r>
+        <mc:AlternateContent>
+          <mc:Choice Requires="wpi">
+            <w:drawing>
+              <wp:anchor distT="0" distB="0" distL="114300" distR="114300" simplePos="0" relativeHeight="251749376" behindDoc="0" locked="0" layoutInCell="1" allowOverlap="1" wp14:anchorId="5452B953" wp14:editId="7BCCF3FC">
+                <wp:simplePos x="0" y="0"/>
+                <wp:positionH relativeFrom="column">
+                  <wp:posOffset>3896463</wp:posOffset>
+                </wp:positionH>
+                <wp:positionV relativeFrom="paragraph">
+                  <wp:posOffset>2126343</wp:posOffset>
+                </wp:positionV>
+                <wp:extent cx="365400" cy="166320"/>
+                <wp:effectExtent l="38100" t="38100" r="0" b="43815"/>
+                <wp:wrapNone/>
+                <wp:docPr id="1795395398" name="Ink 6"/>
+                <wp:cNvGraphicFramePr/>
+                <a:graphic xmlns:a="http://schemas.openxmlformats.org/drawingml/2006/main">
+                  <a:graphicData uri="http://schemas.microsoft.com/office/word/2010/wordprocessingInk">
+                    <w14:contentPart bwMode="auto" r:id="rId59">
+                      <w14:nvContentPartPr>
+                        <w14:cNvContentPartPr/>
+                      </w14:nvContentPartPr>
+                      <w14:xfrm>
+                        <a:off x="0" y="0"/>
+                        <a:ext cx="365400" cy="166320"/>
+                      </w14:xfrm>
+                    </w14:contentPart>
+                  </a:graphicData>
+                </a:graphic>
+              </wp:anchor>
+            </w:drawing>
+          </mc:Choice>
+          <mc:Fallback>
+            <w:pict>
+              <v:shape w14:anchorId="3255B135" id="Ink 6" o:spid="_x0000_s1026" type="#_x0000_t75" style="position:absolute;margin-left:306.45pt;margin-top:167.1pt;width:29.45pt;height:13.85pt;z-index:251749376;visibility:visible;mso-wrap-style:square;mso-wrap-distance-left:9pt;mso-wrap-distance-top:0;mso-wrap-distance-right:9pt;mso-wrap-distance-bottom:0;mso-position-horizontal:absolute;mso-position-horizontal-relative:text;mso-position-vertical:absolute;mso-position-vertical-relative:text" o:gfxdata="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">
+                <v:imagedata r:id="rId60" o:title=""/>
+              </v:shape>
+            </w:pict>
+          </mc:Fallback>
+        </mc:AlternateContent>
+      </w:r>
+      <w:r>
+        <mc:AlternateContent>
+          <mc:Choice Requires="wpi">
+            <w:drawing>
+              <wp:anchor distT="0" distB="0" distL="114300" distR="114300" simplePos="0" relativeHeight="251747328" behindDoc="0" locked="0" layoutInCell="1" allowOverlap="1" wp14:anchorId="1AF83DCE" wp14:editId="31104B0A">
+                <wp:simplePos x="0" y="0"/>
+                <wp:positionH relativeFrom="column">
+                  <wp:posOffset>4905543</wp:posOffset>
+                </wp:positionH>
+                <wp:positionV relativeFrom="paragraph">
+                  <wp:posOffset>1196463</wp:posOffset>
+                </wp:positionV>
+                <wp:extent cx="36000" cy="45000"/>
+                <wp:effectExtent l="38100" t="38100" r="40640" b="31750"/>
+                <wp:wrapNone/>
+                <wp:docPr id="606953637" name="Ink 4"/>
+                <wp:cNvGraphicFramePr/>
+                <a:graphic xmlns:a="http://schemas.openxmlformats.org/drawingml/2006/main">
+                  <a:graphicData uri="http://schemas.microsoft.com/office/word/2010/wordprocessingInk">
+                    <w14:contentPart bwMode="auto" r:id="rId61">
+                      <w14:nvContentPartPr>
+                        <w14:cNvContentPartPr/>
+                      </w14:nvContentPartPr>
+                      <w14:xfrm>
+                        <a:off x="0" y="0"/>
+                        <a:ext cx="36000" cy="45000"/>
+                      </w14:xfrm>
+                    </w14:contentPart>
+                  </a:graphicData>
+                </a:graphic>
+              </wp:anchor>
+            </w:drawing>
+          </mc:Choice>
+          <mc:Fallback>
+            <w:pict>
+              <v:shape w14:anchorId="325B2EAD" id="Ink 4" o:spid="_x0000_s1026" type="#_x0000_t75" style="position:absolute;margin-left:385.9pt;margin-top:93.85pt;width:3.55pt;height:4.25pt;z-index:251747328;visibility:visible;mso-wrap-style:square;mso-wrap-distance-left:9pt;mso-wrap-distance-top:0;mso-wrap-distance-right:9pt;mso-wrap-distance-bottom:0;mso-position-horizontal:absolute;mso-position-horizontal-relative:text;mso-position-vertical:absolute;mso-position-vertical-relative:text" o:gfxdata="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">
+                <v:imagedata r:id="rId62" o:title=""/>
+              </v:shape>
+            </w:pict>
+          </mc:Fallback>
+        </mc:AlternateContent>
+      </w:r>
+      <w:r>
+        <mc:AlternateContent>
+          <mc:Choice Requires="wpi">
+            <w:drawing>
+              <wp:anchor distT="0" distB="0" distL="114300" distR="114300" simplePos="0" relativeHeight="251746304" behindDoc="0" locked="0" layoutInCell="1" allowOverlap="1" wp14:anchorId="71C11A77" wp14:editId="3F372D4E">
+                <wp:simplePos x="0" y="0"/>
+                <wp:positionH relativeFrom="column">
+                  <wp:posOffset>4910583</wp:posOffset>
+                </wp:positionH>
+                <wp:positionV relativeFrom="paragraph">
+                  <wp:posOffset>1195023</wp:posOffset>
+                </wp:positionV>
+                <wp:extent cx="20880" cy="34200"/>
+                <wp:effectExtent l="38100" t="38100" r="36830" b="42545"/>
+                <wp:wrapNone/>
+                <wp:docPr id="2132666266" name="Ink 3"/>
+                <wp:cNvGraphicFramePr/>
+                <a:graphic xmlns:a="http://schemas.openxmlformats.org/drawingml/2006/main">
+                  <a:graphicData uri="http://schemas.microsoft.com/office/word/2010/wordprocessingInk">
+                    <w14:contentPart bwMode="auto" r:id="rId63">
+                      <w14:nvContentPartPr>
+                        <w14:cNvContentPartPr/>
+                      </w14:nvContentPartPr>
+                      <w14:xfrm>
+                        <a:off x="0" y="0"/>
+                        <a:ext cx="20880" cy="34200"/>
+                      </w14:xfrm>
+                    </w14:contentPart>
+                  </a:graphicData>
+                </a:graphic>
+              </wp:anchor>
+            </w:drawing>
+          </mc:Choice>
+          <mc:Fallback>
+            <w:pict>
+              <v:shape w14:anchorId="1F557077" id="Ink 3" o:spid="_x0000_s1026" type="#_x0000_t75" style="position:absolute;margin-left:386.3pt;margin-top:93.75pt;width:2.35pt;height:3.4pt;z-index:251746304;visibility:visible;mso-wrap-style:square;mso-wrap-distance-left:9pt;mso-wrap-distance-top:0;mso-wrap-distance-right:9pt;mso-wrap-distance-bottom:0;mso-position-horizontal:absolute;mso-position-horizontal-relative:text;mso-position-vertical:absolute;mso-position-vertical-relative:text" o:gfxdata="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">
+                <v:imagedata r:id="rId64" o:title=""/>
+              </v:shape>
+            </w:pict>
+          </mc:Fallback>
+        </mc:AlternateContent>
+      </w:r>
+      <w:r>
+        <mc:AlternateContent>
+          <mc:Choice Requires="wpi">
+            <w:drawing>
+              <wp:anchor distT="0" distB="0" distL="114300" distR="114300" simplePos="0" relativeHeight="251745280" behindDoc="0" locked="0" layoutInCell="1" allowOverlap="1" wp14:anchorId="1FB07CB7" wp14:editId="078DA7FB">
+                <wp:simplePos x="0" y="0"/>
+                <wp:positionH relativeFrom="column">
+                  <wp:posOffset>4441143</wp:posOffset>
+                </wp:positionH>
+                <wp:positionV relativeFrom="paragraph">
+                  <wp:posOffset>1143183</wp:posOffset>
+                </wp:positionV>
+                <wp:extent cx="396000" cy="190800"/>
+                <wp:effectExtent l="38100" t="38100" r="23495" b="38100"/>
+                <wp:wrapNone/>
+                <wp:docPr id="2065768470" name="Ink 2"/>
+                <wp:cNvGraphicFramePr/>
+                <a:graphic xmlns:a="http://schemas.openxmlformats.org/drawingml/2006/main">
+                  <a:graphicData uri="http://schemas.microsoft.com/office/word/2010/wordprocessingInk">
+                    <w14:contentPart bwMode="auto" r:id="rId65">
+                      <w14:nvContentPartPr>
+                        <w14:cNvContentPartPr/>
+                      </w14:nvContentPartPr>
+                      <w14:xfrm>
+                        <a:off x="0" y="0"/>
+                        <a:ext cx="396000" cy="190800"/>
+                      </w14:xfrm>
+                    </w14:contentPart>
+                  </a:graphicData>
+                </a:graphic>
+              </wp:anchor>
+            </w:drawing>
+          </mc:Choice>
+          <mc:Fallback>
+            <w:pict>
+              <v:shape w14:anchorId="5E726D2B" id="Ink 2" o:spid="_x0000_s1026" type="#_x0000_t75" style="position:absolute;margin-left:349.35pt;margin-top:89.65pt;width:31.9pt;height:15.7pt;z-index:251745280;visibility:visible;mso-wrap-style:square;mso-wrap-distance-left:9pt;mso-wrap-distance-top:0;mso-wrap-distance-right:9pt;mso-wrap-distance-bottom:0;mso-position-horizontal:absolute;mso-position-horizontal-relative:text;mso-position-vertical:absolute;mso-position-vertical-relative:text" o:gfxdata="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">
+                <v:imagedata r:id="rId66" o:title=""/>
+              </v:shape>
+            </w:pict>
+          </mc:Fallback>
+        </mc:AlternateContent>
+      </w:r>
+      <w:r>
+        <w:drawing>
+          <wp:inline distT="0" distB="0" distL="0" distR="0" wp14:anchorId="1316CF7F" wp14:editId="09220395">
+            <wp:extent cx="5362646" cy="2808514"/>
+            <wp:effectExtent l="190500" t="190500" r="180975" b="182880"/>
+            <wp:docPr id="206810717" name="Picture 1"/>
+            <wp:cNvGraphicFramePr>
+              <a:graphicFrameLocks xmlns:a="http://schemas.openxmlformats.org/drawingml/2006/main" noChangeAspect="1"/>
+            </wp:cNvGraphicFramePr>
+            <a:graphic xmlns:a="http://schemas.openxmlformats.org/drawingml/2006/main">
+              <a:graphicData uri="http://schemas.openxmlformats.org/drawingml/2006/picture">
+                <pic:pic xmlns:pic="http://schemas.openxmlformats.org/drawingml/2006/picture">
+                  <pic:nvPicPr>
+                    <pic:cNvPr id="206810717" name=""/>
+                    <pic:cNvPicPr/>
+                  </pic:nvPicPr>
+                  <pic:blipFill>
+                    <a:blip r:embed="rId67"/>
+                    <a:stretch>
+                      <a:fillRect/>
+                    </a:stretch>
+                  </pic:blipFill>
+                  <pic:spPr>
+                    <a:xfrm>
+                      <a:off x="0" y="0"/>
+                      <a:ext cx="5379573" cy="2817379"/>
+                    </a:xfrm>
+                    <a:prstGeom prst="rect">
+                      <a:avLst/>
+                    </a:prstGeom>
+                    <a:ln>
+                      <a:noFill/>
+                    </a:ln>
+                    <a:effectLst>
+                      <a:outerShdw blurRad="190500" algn="tl" rotWithShape="0">
+                        <a:srgbClr val="000000">
+                          <a:alpha val="70000"/>
+                        </a:srgbClr>
+                      </a:outerShdw>
+                    </a:effectLst>
+                  </pic:spPr>
+                </pic:pic>
+              </a:graphicData>
+            </a:graphic>
+          </wp:inline>
+        </w:drawing>
+      </w:r>
+    </w:p>
+    <w:p>
+      <w:r>
+        <w:t>Block chain oracle provides a way to connect the blockchain to the real world.</w:t>
+      </w:r>
+    </w:p>
+    <w:p>
+      <w:r>
+        <w:t>However:</w:t>
+      </w:r>
+    </w:p>
+    <w:p>
+      <w:pPr>
+        <w:jc w:val="center"/>
+      </w:pPr>
+      <w:r>
+        <w:lastRenderedPageBreak/>
+        <w:drawing>
+          <wp:inline distT="0" distB="0" distL="0" distR="0" wp14:anchorId="7A80475D" wp14:editId="02CD1470">
+            <wp:extent cx="5665694" cy="2891561"/>
+            <wp:effectExtent l="190500" t="190500" r="182880" b="194945"/>
+            <wp:docPr id="1739583766" name="Picture 1"/>
+            <wp:cNvGraphicFramePr>
+              <a:graphicFrameLocks xmlns:a="http://schemas.openxmlformats.org/drawingml/2006/main" noChangeAspect="1"/>
+            </wp:cNvGraphicFramePr>
+            <a:graphic xmlns:a="http://schemas.openxmlformats.org/drawingml/2006/main">
+              <a:graphicData uri="http://schemas.openxmlformats.org/drawingml/2006/picture">
+                <pic:pic xmlns:pic="http://schemas.openxmlformats.org/drawingml/2006/picture">
+                  <pic:nvPicPr>
+                    <pic:cNvPr id="1739583766" name=""/>
+                    <pic:cNvPicPr/>
+                  </pic:nvPicPr>
+                  <pic:blipFill>
+                    <a:blip r:embed="rId68"/>
+                    <a:stretch>
+                      <a:fillRect/>
+                    </a:stretch>
+                  </pic:blipFill>
+                  <pic:spPr>
+                    <a:xfrm>
+                      <a:off x="0" y="0"/>
+                      <a:ext cx="5674561" cy="2896087"/>
+                    </a:xfrm>
+                    <a:prstGeom prst="rect">
+                      <a:avLst/>
+                    </a:prstGeom>
+                    <a:ln>
+                      <a:noFill/>
+                    </a:ln>
+                    <a:effectLst>
+                      <a:outerShdw blurRad="190500" algn="tl" rotWithShape="0">
+                        <a:srgbClr val="000000">
+                          <a:alpha val="70000"/>
+                        </a:srgbClr>
+                      </a:outerShdw>
+                    </a:effectLst>
+                  </pic:spPr>
+                </pic:pic>
+              </a:graphicData>
+            </a:graphic>
+          </wp:inline>
+        </w:drawing>
+      </w:r>
+    </w:p>
+    <w:p>
+      <w:r>
+        <w:t>This is against the whole point of the Web3!</w:t>
+      </w:r>
+    </w:p>
+    <w:p>
+      <w:pPr>
+        <w:jc w:val="center"/>
+        <w:rPr>
+          <w:b/>
+          <w:bCs/>
+        </w:rPr>
+      </w:pPr>
+      <w:r>
+        <w:drawing>
+          <wp:inline distT="0" distB="0" distL="0" distR="0" wp14:anchorId="4B65FDA0" wp14:editId="046A3EDF">
+            <wp:extent cx="5943600" cy="2922905"/>
+            <wp:effectExtent l="190500" t="190500" r="190500" b="182245"/>
+            <wp:docPr id="93895634" name="Picture 1"/>
+            <wp:cNvGraphicFramePr>
+              <a:graphicFrameLocks xmlns:a="http://schemas.openxmlformats.org/drawingml/2006/main" noChangeAspect="1"/>
+            </wp:cNvGraphicFramePr>
+            <a:graphic xmlns:a="http://schemas.openxmlformats.org/drawingml/2006/main">
+              <a:graphicData uri="http://schemas.openxmlformats.org/drawingml/2006/picture">
+                <pic:pic xmlns:pic="http://schemas.openxmlformats.org/drawingml/2006/picture">
+                  <pic:nvPicPr>
+                    <pic:cNvPr id="93895634" name=""/>
+                    <pic:cNvPicPr/>
+                  </pic:nvPicPr>
+                  <pic:blipFill>
+                    <a:blip r:embed="rId69"/>
+                    <a:stretch>
+                      <a:fillRect/>
+                    </a:stretch>
+                  </pic:blipFill>
+                  <pic:spPr>
+                    <a:xfrm>
+                      <a:off x="0" y="0"/>
+                      <a:ext cx="5943600" cy="2922905"/>
+                    </a:xfrm>
+                    <a:prstGeom prst="rect">
+                      <a:avLst/>
+                    </a:prstGeom>
+                    <a:ln>
+                      <a:noFill/>
+                    </a:ln>
+                    <a:effectLst>
+                      <a:outerShdw blurRad="190500" algn="tl" rotWithShape="0">
+                        <a:srgbClr val="000000">
+                          <a:alpha val="70000"/>
+                        </a:srgbClr>
+                      </a:outerShdw>
+                    </a:effectLst>
+                  </pic:spPr>
+                </pic:pic>
+              </a:graphicData>
+            </a:graphic>
+          </wp:inline>
+        </w:drawing>
+      </w:r>
+    </w:p>
+    <w:p>
+      <w:r>
+        <w:t>So how does it work?</w:t>
+      </w:r>
+    </w:p>
+    <w:p>
+      <w:pPr>
+        <w:jc w:val="center"/>
+      </w:pPr>
+      <w:r>
+        <w:lastRenderedPageBreak/>
+        <w:drawing>
+          <wp:inline distT="0" distB="0" distL="0" distR="0" wp14:anchorId="3DB44275" wp14:editId="76787B50">
+            <wp:extent cx="5943600" cy="2605405"/>
+            <wp:effectExtent l="190500" t="190500" r="190500" b="194945"/>
+            <wp:docPr id="164008850" name="Picture 1"/>
+            <wp:cNvGraphicFramePr>
+              <a:graphicFrameLocks xmlns:a="http://schemas.openxmlformats.org/drawingml/2006/main" noChangeAspect="1"/>
+            </wp:cNvGraphicFramePr>
+            <a:graphic xmlns:a="http://schemas.openxmlformats.org/drawingml/2006/main">
+              <a:graphicData uri="http://schemas.openxmlformats.org/drawingml/2006/picture">
+                <pic:pic xmlns:pic="http://schemas.openxmlformats.org/drawingml/2006/picture">
+                  <pic:nvPicPr>
+                    <pic:cNvPr id="164008850" name=""/>
+                    <pic:cNvPicPr/>
+                  </pic:nvPicPr>
+                  <pic:blipFill>
+                    <a:blip r:embed="rId70"/>
+                    <a:stretch>
+                      <a:fillRect/>
+                    </a:stretch>
+                  </pic:blipFill>
+                  <pic:spPr>
+                    <a:xfrm>
+                      <a:off x="0" y="0"/>
+                      <a:ext cx="5943600" cy="2605405"/>
+                    </a:xfrm>
+                    <a:prstGeom prst="rect">
+                      <a:avLst/>
+                    </a:prstGeom>
+                    <a:ln>
+                      <a:noFill/>
+                    </a:ln>
+                    <a:effectLst>
+                      <a:outerShdw blurRad="190500" algn="tl" rotWithShape="0">
+                        <a:srgbClr val="000000">
+                          <a:alpha val="70000"/>
+                        </a:srgbClr>
+                      </a:outerShdw>
+                    </a:effectLst>
+                  </pic:spPr>
+                </pic:pic>
+              </a:graphicData>
+            </a:graphic>
+          </wp:inline>
+        </w:drawing>
+      </w:r>
+    </w:p>
+    <w:p>
+      <w:pPr>
+        <w:jc w:val="center"/>
+        <w:rPr>
+          <w:color w:val="EE0000"/>
+        </w:rPr>
+      </w:pPr>
+      <w:r>
+        <w:rPr>
+          <w:color w:val="EE0000"/>
+        </w:rPr>
+        <w:t xml:space="preserve">It has deployed a reference contract and updates it in the blockchain </w:t>
+      </w:r>
+      <w:r>
+        <w:rPr>
+          <w:color w:val="EE0000"/>
+        </w:rPr>
+        <w:t>w</w:t>
+      </w:r>
+      <w:r>
+        <w:rPr>
+          <w:color w:val="EE0000"/>
+        </w:rPr>
+        <w:t>ith a transaction</w:t>
+      </w:r>
+      <w:r>
+        <w:rPr>
+          <w:color w:val="EE0000"/>
+        </w:rPr>
+        <w:t xml:space="preserve"> say for example once every 1 hour</w:t>
+      </w:r>
+      <w:r>
+        <w:rPr>
+          <w:color w:val="EE0000"/>
+        </w:rPr>
+        <w:t xml:space="preserve">, and all the other contracts </w:t>
+      </w:r>
+      <w:r>
+        <w:rPr>
+          <w:color w:val="EE0000"/>
+        </w:rPr>
+        <w:t>call and fetch data from the deployed contracts</w:t>
+      </w:r>
+      <w:r>
+        <w:rPr>
+          <w:color w:val="EE0000"/>
+        </w:rPr>
+        <w:t>! EZ PZ</w:t>
+      </w:r>
+    </w:p>
+    <w:p>
+      <w:pPr>
+        <w:jc w:val="center"/>
+        <w:rPr>
+          <w:color w:val="EE0000"/>
+        </w:rPr>
+      </w:pPr>
+    </w:p>
+    <w:p>
+      <w:pPr>
+        <w:jc w:val="center"/>
+        <w:rPr>
+          <w:color w:val="EE0000"/>
+        </w:rPr>
+      </w:pPr>
+      <w:r>
+        <w:rPr>
+          <w:color w:val="EE0000"/>
+        </w:rPr>
+        <w:drawing>
+          <wp:inline distT="0" distB="0" distL="0" distR="0" wp14:anchorId="63D44834" wp14:editId="6B47A3CD">
+            <wp:extent cx="5943600" cy="3317875"/>
+            <wp:effectExtent l="190500" t="190500" r="190500" b="187325"/>
+            <wp:docPr id="504434000" name="Picture 1"/>
+            <wp:cNvGraphicFramePr>
+              <a:graphicFrameLocks xmlns:a="http://schemas.openxmlformats.org/drawingml/2006/main" noChangeAspect="1"/>
+            </wp:cNvGraphicFramePr>
+            <a:graphic xmlns:a="http://schemas.openxmlformats.org/drawingml/2006/main">
+              <a:graphicData uri="http://schemas.openxmlformats.org/drawingml/2006/picture">
+                <pic:pic xmlns:pic="http://schemas.openxmlformats.org/drawingml/2006/picture">
+                  <pic:nvPicPr>
+                    <pic:cNvPr id="504434000" name=""/>
+                    <pic:cNvPicPr/>
+                  </pic:nvPicPr>
+                  <pic:blipFill>
+                    <a:blip r:embed="rId71"/>
+                    <a:stretch>
+                      <a:fillRect/>
+                    </a:stretch>
+                  </pic:blipFill>
+                  <pic:spPr>
+                    <a:xfrm>
+                      <a:off x="0" y="0"/>
+                      <a:ext cx="5943600" cy="3317875"/>
+                    </a:xfrm>
+                    <a:prstGeom prst="rect">
+                      <a:avLst/>
+                    </a:prstGeom>
+                    <a:ln>
+                      <a:noFill/>
+                    </a:ln>
+                    <a:effectLst>
+                      <a:outerShdw blurRad="190500" algn="tl" rotWithShape="0">
+                        <a:srgbClr val="000000">
+                          <a:alpha val="70000"/>
+                        </a:srgbClr>
+                      </a:outerShdw>
+                    </a:effectLst>
+                  </pic:spPr>
+                </pic:pic>
+              </a:graphicData>
+            </a:graphic>
+          </wp:inline>
+        </w:drawing>
+      </w:r>
+    </w:p>
+    <w:p>
+      <w:pPr>
+        <w:jc w:val="center"/>
+        <w:rPr>
+          <w:color w:val="EE0000"/>
+        </w:rPr>
+      </w:pPr>
+    </w:p>
+    <w:p>
+      <w:pPr>
+        <w:rPr>
+          <w:color w:val="EE0000"/>
+        </w:rPr>
+      </w:pPr>
+      <w:r>
+        <w:rPr>
+          <w:color w:val="EE0000"/>
+        </w:rPr>
+        <w:lastRenderedPageBreak/>
+        <w:t>Use docs.chain.link to see the addresses of each deployed reference contract. (use chatgpt to fetch the link and do the job), I deployed one for sepolia using this code:</w:t>
+      </w:r>
+    </w:p>
+    <w:p>
+      <w:pPr>
+        <w:pStyle w:val="codesnippet"/>
+        <w:framePr w:wrap="notBeside"/>
+        <w:rPr>
+          <w:color w:val="A2A3BD"/>
+        </w:rPr>
+      </w:pPr>
+      <w:r>
+        <w:t>// SPDX-License-Identifier: MIT</w:t>
+      </w:r>
+    </w:p>
+    <w:p>
+      <w:pPr>
+        <w:pStyle w:val="codesnippet"/>
+        <w:framePr w:wrap="notBeside"/>
+        <w:rPr>
+          <w:color w:val="A2A3BD"/>
+        </w:rPr>
+      </w:pPr>
+      <w:r>
+        <w:rPr>
+          <w:color w:val="569CD6"/>
+        </w:rPr>
+        <w:t>pragma</w:t>
+      </w:r>
+      <w:r>
+        <w:rPr>
+          <w:color w:val="A2A3BD"/>
+        </w:rPr>
+        <w:t xml:space="preserve"> </w:t>
+      </w:r>
+      <w:r>
+        <w:rPr>
+          <w:color w:val="569CD6"/>
+        </w:rPr>
+        <w:t>solidity</w:t>
+      </w:r>
+      <w:r>
+        <w:rPr>
+          <w:color w:val="A2A3BD"/>
+        </w:rPr>
+        <w:t xml:space="preserve"> </w:t>
+      </w:r>
+      <w:r>
+        <w:rPr>
+          <w:color w:val="DCDCDC"/>
+        </w:rPr>
+        <w:t>^</w:t>
+      </w:r>
+      <w:r>
+        <w:rPr>
+          <w:color w:val="B5CEA8"/>
+        </w:rPr>
+        <w:t>0.8.7</w:t>
+      </w:r>
+      <w:r>
+        <w:rPr>
+          <w:color w:val="DCDCDC"/>
+        </w:rPr>
+        <w:t>;</w:t>
+      </w:r>
+    </w:p>
+    <w:p>
+      <w:pPr>
+        <w:pStyle w:val="codesnippet"/>
+        <w:framePr w:wrap="notBeside"/>
+        <w:rPr>
+          <w:color w:val="A2A3BD"/>
+        </w:rPr>
+      </w:pPr>
+    </w:p>
+    <w:p>
+      <w:pPr>
+        <w:pStyle w:val="codesnippet"/>
+        <w:framePr w:wrap="notBeside"/>
+        <w:rPr>
+          <w:color w:val="A2A3BD"/>
+        </w:rPr>
+      </w:pPr>
+      <w:r>
+        <w:rPr>
+          <w:color w:val="569CD6"/>
+        </w:rPr>
+        <w:t>import</w:t>
+      </w:r>
+      <w:r>
+        <w:rPr>
+          <w:color w:val="A2A3BD"/>
+        </w:rPr>
+        <w:t xml:space="preserve"> </w:t>
+      </w:r>
+      <w:r>
+        <w:rPr>
+          <w:color w:val="DCDCDC"/>
+        </w:rPr>
+        <w:t>{</w:t>
+      </w:r>
+      <w:r>
+        <w:rPr>
+          <w:color w:val="A2A3BD"/>
+        </w:rPr>
+        <w:t>AggregatorV3Interface</w:t>
+      </w:r>
+      <w:r>
+        <w:rPr>
+          <w:color w:val="DCDCDC"/>
+        </w:rPr>
+        <w:t>}</w:t>
+      </w:r>
+      <w:r>
+        <w:rPr>
+          <w:color w:val="A2A3BD"/>
+        </w:rPr>
+        <w:t xml:space="preserve"> from </w:t>
+      </w:r>
+      <w:r>
+        <w:rPr>
+          <w:color w:val="CE9178"/>
+        </w:rPr>
+        <w:t>"@chainlink/contracts@1.5.0/src/v0.8/shared/interfaces/AggregatorV3Interface.sol"</w:t>
+      </w:r>
+      <w:r>
+        <w:rPr>
+          <w:color w:val="DCDCDC"/>
+        </w:rPr>
+        <w:t>;</w:t>
+      </w:r>
+    </w:p>
+    <w:p>
+      <w:pPr>
+        <w:pStyle w:val="codesnippet"/>
+        <w:framePr w:wrap="notBeside"/>
+        <w:rPr>
+          <w:color w:val="A2A3BD"/>
+        </w:rPr>
+      </w:pPr>
+    </w:p>
+    <w:p>
+      <w:pPr>
+        <w:pStyle w:val="codesnippet"/>
+        <w:framePr w:wrap="notBeside"/>
+        <w:rPr>
+          <w:color w:val="A2A3BD"/>
+        </w:rPr>
+      </w:pPr>
+      <w:r>
+        <w:rPr>
+          <w:color w:val="569CD6"/>
+        </w:rPr>
+        <w:t>contract</w:t>
+      </w:r>
+      <w:r>
+        <w:rPr>
+          <w:color w:val="A2A3BD"/>
+        </w:rPr>
+        <w:t xml:space="preserve"> DataConsumerV3 </w:t>
+      </w:r>
+      <w:r>
+        <w:rPr>
+          <w:color w:val="DCDCDC"/>
+        </w:rPr>
+        <w:t>{</w:t>
+      </w:r>
+    </w:p>
+    <w:p>
+      <w:pPr>
+        <w:pStyle w:val="codesnippet"/>
+        <w:framePr w:wrap="notBeside"/>
+        <w:rPr>
+          <w:color w:val="A2A3BD"/>
+        </w:rPr>
+      </w:pPr>
+      <w:r>
+        <w:rPr>
+          <w:color w:val="A2A3BD"/>
+        </w:rPr>
+        <w:t xml:space="preserve">  AggregatorV3Interface </w:t>
+      </w:r>
+      <w:r>
+        <w:rPr>
+          <w:color w:val="00BC8C"/>
+        </w:rPr>
+        <w:t>internal</w:t>
+      </w:r>
+      <w:r>
+        <w:rPr>
+          <w:color w:val="A2A3BD"/>
+        </w:rPr>
+        <w:t xml:space="preserve"> </w:t>
+      </w:r>
+      <w:proofErr w:type="spellStart"/>
+      <w:r>
+        <w:rPr>
+          <w:color w:val="A2A3BD"/>
+        </w:rPr>
+        <w:t>dataFeed</w:t>
+      </w:r>
+      <w:proofErr w:type="spellEnd"/>
+      <w:r>
+        <w:rPr>
+          <w:color w:val="DCDCDC"/>
+        </w:rPr>
+        <w:t>;</w:t>
+      </w:r>
+    </w:p>
+    <w:p>
+      <w:pPr>
+        <w:pStyle w:val="codesnippet"/>
+        <w:framePr w:wrap="notBeside"/>
+        <w:rPr>
+          <w:color w:val="A2A3BD"/>
+        </w:rPr>
+      </w:pPr>
+    </w:p>
+    <w:p>
+      <w:pPr>
+        <w:pStyle w:val="codesnippet"/>
+        <w:framePr w:wrap="notBeside"/>
+        <w:rPr>
+          <w:color w:val="A2A3BD"/>
+        </w:rPr>
+      </w:pPr>
+      <w:r>
+        <w:rPr>
+          <w:color w:val="A2A3BD"/>
+        </w:rPr>
+        <w:t xml:space="preserve">  </w:t>
+      </w:r>
+      <w:r>
+        <w:rPr>
+          <w:color w:val="E83E8C"/>
+        </w:rPr>
+        <w:t>constructor</w:t>
+      </w:r>
+      <w:r>
+        <w:rPr>
+          <w:color w:val="DCDCDC"/>
+        </w:rPr>
+        <w:t>()</w:t>
+      </w:r>
+      <w:r>
+        <w:rPr>
+          <w:color w:val="A2A3BD"/>
+        </w:rPr>
+        <w:t xml:space="preserve"> </w:t>
+      </w:r>
+      <w:r>
+        <w:rPr>
+          <w:color w:val="DCDCDC"/>
+        </w:rPr>
+        <w:t>{</w:t>
+      </w:r>
+    </w:p>
+    <w:p>
+      <w:pPr>
+        <w:pStyle w:val="codesnippet"/>
+        <w:framePr w:wrap="notBeside"/>
+        <w:rPr>
+          <w:color w:val="A2A3BD"/>
+        </w:rPr>
+      </w:pPr>
+      <w:r>
+        <w:rPr>
+          <w:color w:val="A2A3BD"/>
+        </w:rPr>
+        <w:t xml:space="preserve">    </w:t>
+      </w:r>
+      <w:proofErr w:type="spellStart"/>
+      <w:r>
+        <w:rPr>
+          <w:color w:val="A2A3BD"/>
+        </w:rPr>
+        <w:t>dataFeed</w:t>
+      </w:r>
+      <w:proofErr w:type="spellEnd"/>
+      <w:r>
+        <w:rPr>
+          <w:color w:val="A2A3BD"/>
+        </w:rPr>
+        <w:t xml:space="preserve"> </w:t>
+      </w:r>
+      <w:r>
+        <w:rPr>
+          <w:color w:val="DCDCDC"/>
+        </w:rPr>
+        <w:t>=</w:t>
+      </w:r>
+      <w:r>
+        <w:rPr>
+          <w:color w:val="A2A3BD"/>
+        </w:rPr>
+        <w:t xml:space="preserve"> AggregatorV3Interface</w:t>
+      </w:r>
+      <w:r>
+        <w:rPr>
+          <w:color w:val="DCDCDC"/>
+        </w:rPr>
+        <w:t>(</w:t>
+      </w:r>
+      <w:r>
+        <w:rPr>
+          <w:color w:val="5BB498"/>
+        </w:rPr>
+        <w:t>0x1b44F3514812d835EB1BDB0acB33d3fA3351Ee43</w:t>
+      </w:r>
+      <w:r>
+        <w:rPr>
+          <w:color w:val="DCDCDC"/>
+        </w:rPr>
+        <w:t>);</w:t>
+      </w:r>
+    </w:p>
+    <w:p>
+      <w:pPr>
+        <w:pStyle w:val="codesnippet"/>
+        <w:framePr w:wrap="notBeside"/>
+        <w:rPr>
+          <w:color w:val="A2A3BD"/>
+        </w:rPr>
+      </w:pPr>
+      <w:r>
+        <w:rPr>
+          <w:color w:val="A2A3BD"/>
+        </w:rPr>
+        <w:t xml:space="preserve">  </w:t>
+      </w:r>
+      <w:r>
+        <w:rPr>
+          <w:color w:val="DCDCDC"/>
+        </w:rPr>
+        <w:t>}</w:t>
+      </w:r>
+    </w:p>
+    <w:p>
+      <w:pPr>
+        <w:pStyle w:val="codesnippet"/>
+        <w:framePr w:wrap="notBeside"/>
+        <w:rPr>
+          <w:color w:val="A2A3BD"/>
+        </w:rPr>
+      </w:pPr>
+    </w:p>
+    <w:p>
+      <w:pPr>
+        <w:pStyle w:val="codesnippet"/>
+        <w:framePr w:wrap="notBeside"/>
+        <w:rPr>
+          <w:color w:val="A2A3BD"/>
+        </w:rPr>
+      </w:pPr>
+      <w:r>
+        <w:rPr>
+          <w:color w:val="A2A3BD"/>
+        </w:rPr>
+        <w:t xml:space="preserve">  </w:t>
+      </w:r>
+      <w:r>
+        <w:rPr>
+          <w:color w:val="569CD6"/>
+        </w:rPr>
+        <w:t>function</w:t>
+      </w:r>
+      <w:r>
+        <w:rPr>
+          <w:color w:val="A2A3BD"/>
+        </w:rPr>
+        <w:t xml:space="preserve"> </w:t>
+      </w:r>
+      <w:proofErr w:type="spellStart"/>
+      <w:r>
+        <w:rPr>
+          <w:color w:val="A2A3BD"/>
+        </w:rPr>
+        <w:t>getChainlinkDataFeedLatestAnswer</w:t>
+      </w:r>
+      <w:proofErr w:type="spellEnd"/>
+      <w:r>
+        <w:rPr>
+          <w:color w:val="DCDCDC"/>
+        </w:rPr>
+        <w:t>()</w:t>
+      </w:r>
+      <w:r>
+        <w:rPr>
+          <w:color w:val="A2A3BD"/>
+        </w:rPr>
+        <w:t xml:space="preserve"> </w:t>
+      </w:r>
+      <w:r>
+        <w:rPr>
+          <w:color w:val="00BC8C"/>
+        </w:rPr>
+        <w:t>public</w:t>
+      </w:r>
+      <w:r>
+        <w:rPr>
+          <w:color w:val="A2A3BD"/>
+        </w:rPr>
+        <w:t xml:space="preserve"> </w:t>
+      </w:r>
+      <w:r>
+        <w:rPr>
+          <w:color w:val="00BC8C"/>
+        </w:rPr>
+        <w:t>view</w:t>
+      </w:r>
+      <w:r>
+        <w:rPr>
+          <w:color w:val="A2A3BD"/>
+        </w:rPr>
+        <w:t xml:space="preserve"> </w:t>
+      </w:r>
+      <w:r>
+        <w:rPr>
+          <w:color w:val="00BC8C"/>
+        </w:rPr>
+        <w:t>returns</w:t>
+      </w:r>
+      <w:r>
+        <w:rPr>
+          <w:color w:val="A2A3BD"/>
+        </w:rPr>
+        <w:t xml:space="preserve"> </w:t>
+      </w:r>
+      <w:r>
+        <w:rPr>
+          <w:color w:val="DCDCDC"/>
+        </w:rPr>
+        <w:t>(</w:t>
+      </w:r>
+      <w:r>
+        <w:rPr>
+          <w:color w:val="569CD6"/>
+        </w:rPr>
+        <w:t>int256</w:t>
+      </w:r>
+      <w:r>
+        <w:rPr>
+          <w:color w:val="DCDCDC"/>
+        </w:rPr>
+        <w:t>)</w:t>
+      </w:r>
+      <w:r>
+        <w:rPr>
+          <w:color w:val="A2A3BD"/>
+        </w:rPr>
+        <w:t xml:space="preserve"> </w:t>
+      </w:r>
+      <w:r>
+        <w:rPr>
+          <w:color w:val="DCDCDC"/>
+        </w:rPr>
+        <w:t>{</w:t>
+      </w:r>
+    </w:p>
+    <w:p>
+      <w:pPr>
+        <w:pStyle w:val="codesnippet"/>
+        <w:framePr w:wrap="notBeside"/>
+        <w:rPr>
+          <w:color w:val="A2A3BD"/>
+        </w:rPr>
+      </w:pPr>
+      <w:r>
+        <w:rPr>
+          <w:color w:val="A2A3BD"/>
+        </w:rPr>
+        <w:t xml:space="preserve">    </w:t>
+      </w:r>
+      <w:r>
+        <w:t>// prettier-ignore</w:t>
+      </w:r>
+    </w:p>
+    <w:p>
+      <w:pPr>
+        <w:pStyle w:val="codesnippet"/>
+        <w:framePr w:wrap="notBeside"/>
+        <w:rPr>
+          <w:color w:val="A2A3BD"/>
+        </w:rPr>
+      </w:pPr>
+      <w:r>
+        <w:rPr>
+          <w:color w:val="A2A3BD"/>
+        </w:rPr>
+        <w:t xml:space="preserve">    </w:t>
+      </w:r>
+      <w:r>
+        <w:rPr>
+          <w:color w:val="DCDCDC"/>
+        </w:rPr>
+        <w:t>(</w:t>
+      </w:r>
+    </w:p>
+    <w:p>
+      <w:pPr>
+        <w:pStyle w:val="codesnippet"/>
+        <w:framePr w:wrap="notBeside"/>
+        <w:rPr>
+          <w:color w:val="A2A3BD"/>
+        </w:rPr>
+      </w:pPr>
+      <w:r>
+        <w:rPr>
+          <w:color w:val="A2A3BD"/>
+        </w:rPr>
+        <w:t xml:space="preserve">      </w:t>
+      </w:r>
+      <w:r>
+        <w:t xml:space="preserve">/* uint80 </w:t>
+      </w:r>
+      <w:proofErr w:type="spellStart"/>
+      <w:r>
+        <w:t>roundId</w:t>
+      </w:r>
+      <w:proofErr w:type="spellEnd"/>
+      <w:r>
+        <w:t xml:space="preserve"> */</w:t>
+      </w:r>
+    </w:p>
+    <w:p>
+      <w:pPr>
+        <w:pStyle w:val="codesnippet"/>
+        <w:framePr w:wrap="notBeside"/>
+        <w:rPr>
+          <w:color w:val="A2A3BD"/>
+        </w:rPr>
+      </w:pPr>
+      <w:r>
+        <w:rPr>
+          <w:color w:val="A2A3BD"/>
+        </w:rPr>
+        <w:t xml:space="preserve">      </w:t>
+      </w:r>
+      <w:r>
+        <w:rPr>
+          <w:color w:val="DCDCDC"/>
+        </w:rPr>
+        <w:t>,</w:t>
+      </w:r>
+    </w:p>
+    <w:p>
+      <w:pPr>
+        <w:pStyle w:val="codesnippet"/>
+        <w:framePr w:wrap="notBeside"/>
+        <w:rPr>
+          <w:color w:val="A2A3BD"/>
+        </w:rPr>
+      </w:pPr>
+      <w:r>
+        <w:rPr>
+          <w:color w:val="A2A3BD"/>
+        </w:rPr>
+        <w:t xml:space="preserve">      </w:t>
+      </w:r>
+      <w:r>
+        <w:rPr>
+          <w:color w:val="569CD6"/>
+        </w:rPr>
+        <w:t>int256</w:t>
+      </w:r>
+      <w:r>
+        <w:rPr>
+          <w:color w:val="A2A3BD"/>
+        </w:rPr>
+        <w:t xml:space="preserve"> answer</w:t>
+      </w:r>
+      <w:r>
+        <w:rPr>
+          <w:color w:val="DCDCDC"/>
+        </w:rPr>
+        <w:t>,</w:t>
+      </w:r>
+    </w:p>
+    <w:p>
+      <w:pPr>
+        <w:pStyle w:val="codesnippet"/>
+        <w:framePr w:wrap="notBeside"/>
+        <w:rPr>
+          <w:color w:val="A2A3BD"/>
+        </w:rPr>
+      </w:pPr>
+      <w:r>
+        <w:rPr>
+          <w:color w:val="A2A3BD"/>
+        </w:rPr>
+        <w:t xml:space="preserve">      </w:t>
+      </w:r>
+      <w:r>
+        <w:t xml:space="preserve">/*uint256 </w:t>
+      </w:r>
+      <w:proofErr w:type="spellStart"/>
+      <w:r>
+        <w:t>startedAt</w:t>
+      </w:r>
+      <w:proofErr w:type="spellEnd"/>
+      <w:r>
+        <w:t>*/</w:t>
+      </w:r>
+    </w:p>
+    <w:p>
+      <w:pPr>
+        <w:pStyle w:val="codesnippet"/>
+        <w:framePr w:wrap="notBeside"/>
+        <w:rPr>
+          <w:color w:val="A2A3BD"/>
+        </w:rPr>
+      </w:pPr>
+      <w:r>
+        <w:rPr>
+          <w:color w:val="A2A3BD"/>
+        </w:rPr>
+        <w:t xml:space="preserve">      </w:t>
+      </w:r>
+      <w:r>
+        <w:rPr>
+          <w:color w:val="DCDCDC"/>
+        </w:rPr>
+        <w:t>,</w:t>
+      </w:r>
+    </w:p>
+    <w:p>
+      <w:pPr>
+        <w:pStyle w:val="codesnippet"/>
+        <w:framePr w:wrap="notBeside"/>
+        <w:rPr>
+          <w:color w:val="A2A3BD"/>
+        </w:rPr>
+      </w:pPr>
+      <w:r>
+        <w:rPr>
+          <w:color w:val="A2A3BD"/>
+        </w:rPr>
+        <w:t xml:space="preserve">      </w:t>
+      </w:r>
+      <w:r>
+        <w:t xml:space="preserve">/*uint256 </w:t>
+      </w:r>
+      <w:proofErr w:type="spellStart"/>
+      <w:r>
+        <w:t>updatedAt</w:t>
+      </w:r>
+      <w:proofErr w:type="spellEnd"/>
+      <w:r>
+        <w:t>*/</w:t>
+      </w:r>
+    </w:p>
+    <w:p>
+      <w:pPr>
+        <w:pStyle w:val="codesnippet"/>
+        <w:framePr w:wrap="notBeside"/>
+        <w:rPr>
+          <w:color w:val="A2A3BD"/>
+        </w:rPr>
+      </w:pPr>
+      <w:r>
+        <w:rPr>
+          <w:color w:val="A2A3BD"/>
+        </w:rPr>
+        <w:t xml:space="preserve">      </w:t>
+      </w:r>
+      <w:r>
+        <w:rPr>
+          <w:color w:val="DCDCDC"/>
+        </w:rPr>
+        <w:t>,</w:t>
+      </w:r>
+    </w:p>
+    <w:p>
+      <w:pPr>
+        <w:pStyle w:val="codesnippet"/>
+        <w:framePr w:wrap="notBeside"/>
+        <w:rPr>
+          <w:color w:val="A2A3BD"/>
+        </w:rPr>
+      </w:pPr>
+      <w:r>
+        <w:rPr>
+          <w:color w:val="A2A3BD"/>
+        </w:rPr>
+        <w:t xml:space="preserve">      </w:t>
+      </w:r>
+      <w:r>
+        <w:t xml:space="preserve">/*uint80 </w:t>
+      </w:r>
+      <w:proofErr w:type="spellStart"/>
+      <w:r>
+        <w:t>answeredInRound</w:t>
+      </w:r>
+      <w:proofErr w:type="spellEnd"/>
+      <w:r>
+        <w:t>*/</w:t>
+      </w:r>
+    </w:p>
+    <w:p>
+      <w:pPr>
+        <w:pStyle w:val="codesnippet"/>
+        <w:framePr w:wrap="notBeside"/>
+        <w:rPr>
+          <w:color w:val="A2A3BD"/>
+        </w:rPr>
+      </w:pPr>
+      <w:r>
+        <w:rPr>
+          <w:color w:val="A2A3BD"/>
+        </w:rPr>
+        <w:t xml:space="preserve">    </w:t>
+      </w:r>
+      <w:r>
+        <w:rPr>
+          <w:color w:val="DCDCDC"/>
+        </w:rPr>
+        <w:t>)</w:t>
+      </w:r>
+      <w:r>
+        <w:rPr>
+          <w:color w:val="A2A3BD"/>
+        </w:rPr>
+        <w:t xml:space="preserve"> </w:t>
+      </w:r>
+      <w:r>
+        <w:rPr>
+          <w:color w:val="DCDCDC"/>
+        </w:rPr>
+        <w:t>=</w:t>
+      </w:r>
+      <w:r>
+        <w:rPr>
+          <w:color w:val="A2A3BD"/>
+        </w:rPr>
+        <w:t xml:space="preserve"> </w:t>
+      </w:r>
+      <w:proofErr w:type="spellStart"/>
+      <w:r>
+        <w:rPr>
+          <w:color w:val="A2A3BD"/>
+        </w:rPr>
+        <w:t>dataFeed</w:t>
+      </w:r>
+      <w:r>
+        <w:rPr>
+          <w:color w:val="DCDCDC"/>
+        </w:rPr>
+        <w:t>.</w:t>
+      </w:r>
+      <w:r>
+        <w:rPr>
+          <w:color w:val="A2A3BD"/>
+        </w:rPr>
+        <w:t>latestRoundData</w:t>
+      </w:r>
+      <w:proofErr w:type="spellEnd"/>
+      <w:r>
+        <w:rPr>
+          <w:color w:val="DCDCDC"/>
+        </w:rPr>
+        <w:t>();</w:t>
+      </w:r>
+    </w:p>
+    <w:p>
+      <w:pPr>
+        <w:pStyle w:val="codesnippet"/>
+        <w:framePr w:wrap="notBeside"/>
+        <w:rPr>
+          <w:color w:val="A2A3BD"/>
+        </w:rPr>
+      </w:pPr>
+      <w:r>
+        <w:rPr>
+          <w:color w:val="A2A3BD"/>
+        </w:rPr>
+        <w:t xml:space="preserve">    </w:t>
+      </w:r>
+      <w:r>
+        <w:rPr>
+          <w:color w:val="00BC8C"/>
+        </w:rPr>
+        <w:t>return</w:t>
+      </w:r>
+      <w:r>
+        <w:rPr>
+          <w:color w:val="A2A3BD"/>
+        </w:rPr>
+        <w:t xml:space="preserve"> answer</w:t>
+      </w:r>
+      <w:r>
+        <w:rPr>
+          <w:color w:val="DCDCDC"/>
+        </w:rPr>
+        <w:t>;</w:t>
+      </w:r>
+    </w:p>
+    <w:p>
+      <w:pPr>
+        <w:pStyle w:val="codesnippet"/>
+        <w:framePr w:wrap="notBeside"/>
+        <w:rPr>
+          <w:color w:val="A2A3BD"/>
+        </w:rPr>
+      </w:pPr>
+      <w:r>
+        <w:rPr>
+          <w:color w:val="A2A3BD"/>
+        </w:rPr>
+        <w:t xml:space="preserve">  </w:t>
+      </w:r>
+      <w:r>
+        <w:rPr>
+          <w:color w:val="DCDCDC"/>
+        </w:rPr>
+        <w:t>}</w:t>
+      </w:r>
+    </w:p>
+    <w:p>
+      <w:pPr>
+        <w:pStyle w:val="codesnippet"/>
+        <w:framePr w:wrap="notBeside"/>
+        <w:rPr>
+          <w:color w:val="A2A3BD"/>
+        </w:rPr>
+      </w:pPr>
+      <w:r>
+        <w:rPr>
+          <w:color w:val="DCDCDC"/>
+        </w:rPr>
+        <w:t>}</w:t>
+      </w:r>
+    </w:p>
+    <w:p>
+      <w:pPr>
+        <w:rPr>
+          <w:color w:val="EE0000"/>
+        </w:rPr>
+      </w:pPr>
+    </w:p>
+    <w:p>
+      <w:r>
+        <w:t>Here are the addresses for each network you are deplo</w:t>
+      </w:r>
+      <w:r>
+        <w:t>y</w:t>
+      </w:r>
+      <w:r>
+        <w:t>ing on and all the converters:</w:t>
+      </w:r>
+    </w:p>
+    <w:p>
+      <w:hyperlink r:id="rId72" w:history="1">
+        <w:r>
+          <w:rPr>
+            <w:rStyle w:val="Hyperlink"/>
+          </w:rPr>
+          <w:t>https://docs.chain.link/data-feeds/price-feeds/addresses?networkType=testnet</w:t>
+        </w:r>
+      </w:hyperlink>
+    </w:p>
+    <w:p>
+      <w:pPr>
+        <w:jc w:val="center"/>
+      </w:pPr>
+      <w:r>
+        <mc:AlternateContent>
+          <mc:Choice Requires="wpi">
+            <w:drawing>
+              <wp:anchor distT="0" distB="0" distL="114300" distR="114300" simplePos="0" relativeHeight="251802624" behindDoc="0" locked="0" layoutInCell="1" allowOverlap="1" wp14:anchorId="0344959D" wp14:editId="67265831">
+                <wp:simplePos x="0" y="0"/>
+                <wp:positionH relativeFrom="column">
+                  <wp:posOffset>3316507</wp:posOffset>
+                </wp:positionH>
+                <wp:positionV relativeFrom="paragraph">
+                  <wp:posOffset>1118220</wp:posOffset>
+                </wp:positionV>
+                <wp:extent cx="2134800" cy="1770840"/>
+                <wp:effectExtent l="38100" t="38100" r="37465" b="39370"/>
+                <wp:wrapNone/>
+                <wp:docPr id="2018157180" name="Ink 66"/>
+                <wp:cNvGraphicFramePr/>
+                <a:graphic xmlns:a="http://schemas.openxmlformats.org/drawingml/2006/main">
+                  <a:graphicData uri="http://schemas.microsoft.com/office/word/2010/wordprocessingInk">
+                    <w14:contentPart bwMode="auto" r:id="rId73">
+                      <w14:nvContentPartPr>
+                        <w14:cNvContentPartPr/>
+                      </w14:nvContentPartPr>
+                      <w14:xfrm>
+                        <a:off x="0" y="0"/>
+                        <a:ext cx="2134800" cy="1770840"/>
+                      </w14:xfrm>
+                    </w14:contentPart>
+                  </a:graphicData>
+                </a:graphic>
+              </wp:anchor>
+            </w:drawing>
+          </mc:Choice>
+          <mc:Fallback>
+            <w:pict>
+              <v:shape w14:anchorId="18F328F7" id="Ink 66" o:spid="_x0000_s1026" type="#_x0000_t75" style="position:absolute;margin-left:260.8pt;margin-top:87.7pt;width:168.8pt;height:140.15pt;z-index:251802624;visibility:visible;mso-wrap-style:square;mso-wrap-distance-left:9pt;mso-wrap-distance-top:0;mso-wrap-distance-right:9pt;mso-wrap-distance-bottom:0;mso-position-horizontal:absolute;mso-position-horizontal-relative:text;mso-position-vertical:absolute;mso-position-vertical-relative:text" o:gfxdata="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">
+                <v:imagedata r:id="rId74" o:title=""/>
+              </v:shape>
+            </w:pict>
+          </mc:Fallback>
+        </mc:AlternateContent>
+      </w:r>
+      <w:r>
+        <w:drawing>
+          <wp:inline distT="0" distB="0" distL="0" distR="0" wp14:anchorId="2F63FB71" wp14:editId="5DBD278E">
+            <wp:extent cx="4681538" cy="2354774"/>
+            <wp:effectExtent l="190500" t="190500" r="195580" b="198120"/>
+            <wp:docPr id="1195984718" name="Picture 1"/>
+            <wp:cNvGraphicFramePr>
+              <a:graphicFrameLocks xmlns:a="http://schemas.openxmlformats.org/drawingml/2006/main" noChangeAspect="1"/>
+            </wp:cNvGraphicFramePr>
+            <a:graphic xmlns:a="http://schemas.openxmlformats.org/drawingml/2006/main">
+              <a:graphicData uri="http://schemas.openxmlformats.org/drawingml/2006/picture">
+                <pic:pic xmlns:pic="http://schemas.openxmlformats.org/drawingml/2006/picture">
+                  <pic:nvPicPr>
+                    <pic:cNvPr id="1195984718" name=""/>
+                    <pic:cNvPicPr/>
+                  </pic:nvPicPr>
+                  <pic:blipFill>
+                    <a:blip r:embed="rId75"/>
+                    <a:stretch>
+                      <a:fillRect/>
+                    </a:stretch>
+                  </pic:blipFill>
+                  <pic:spPr>
+                    <a:xfrm>
+                      <a:off x="0" y="0"/>
+                      <a:ext cx="4684104" cy="2356065"/>
+                    </a:xfrm>
+                    <a:prstGeom prst="rect">
+                      <a:avLst/>
+                    </a:prstGeom>
+                    <a:ln>
+                      <a:noFill/>
+                    </a:ln>
+                    <a:effectLst>
+                      <a:outerShdw blurRad="190500" algn="tl" rotWithShape="0">
+                        <a:srgbClr val="000000">
+                          <a:alpha val="70000"/>
+                        </a:srgbClr>
+                      </a:outerShdw>
+                    </a:effectLst>
+                  </pic:spPr>
+                </pic:pic>
+              </a:graphicData>
+            </a:graphic>
+          </wp:inline>
+        </w:drawing>
       </w:r>
     </w:p>
     <w:p/>
@@ -7576,6 +9511,29 @@
     <w:basedOn w:val="DefaultParagraphFont"/>
     <w:rsid w:val="00BB3F09"/>
   </w:style>
+  <w:style w:type="character" w:styleId="Hyperlink">
+    <w:name w:val="Hyperlink"/>
+    <w:basedOn w:val="DefaultParagraphFont"/>
+    <w:uiPriority w:val="99"/>
+    <w:unhideWhenUsed/>
+    <w:rsid w:val="00B217A9"/>
+    <w:rPr>
+      <w:color w:val="0563C1" w:themeColor="hyperlink"/>
+      <w:u w:val="single"/>
+    </w:rPr>
+  </w:style>
+  <w:style w:type="character" w:styleId="UnresolvedMention">
+    <w:name w:val="Unresolved Mention"/>
+    <w:basedOn w:val="DefaultParagraphFont"/>
+    <w:uiPriority w:val="99"/>
+    <w:semiHidden/>
+    <w:unhideWhenUsed/>
+    <w:rsid w:val="00B217A9"/>
+    <w:rPr>
+      <w:color w:val="605E5C"/>
+      <w:shd w:val="clear" w:color="auto" w:fill="E1DFDD"/>
+    </w:rPr>
+  </w:style>
 </w:styles>
 </file>
 
@@ -7604,7 +9562,7 @@
     </inkml:brush>
   </inkml:definitions>
   <inkml:trace contextRef="#ctx0" brushRef="#br0">3600 630 24575,'-1'3'0,"-1"0"0,1-1 0,-1 1 0,0 0 0,0-1 0,0 1 0,0-1 0,0 0 0,-1 0 0,1 0 0,-1 0 0,1 0 0,-1 0 0,0-1 0,-4 3 0,4-3 0,-21 12 0,-1-1 0,0-1 0,-1-2 0,0-1 0,-47 10 0,9-8 0,-85 3 0,78-10 0,12-2 0,1 3 0,-88 17 0,87-9 0,0-3 0,-81 2 0,-122-12 0,100-2 0,-217 5 0,-428-4 0,734-3 0,1-3 0,-118-30 0,95 18 0,48 11 0,19 4 0,0-1 0,0-1 0,1-1 0,-45-20 0,10 0 0,37 19 0,1-2 0,-39-24 0,56 30 0,1 1 0,0-1 0,1 0 0,-1 0 0,1-1 0,0 0 0,0 0 0,1 0 0,-1 0 0,1-1 0,1 1 0,-1-1 0,-4-14 0,-7-21 0,11 35 0,1-1 0,0 0 0,0 0 0,1 0 0,0 0 0,0-1 0,1 1 0,0-12 0,1 14 0,1 0 0,-1 0 0,1 0 0,1 1 0,-1-1 0,1 0 0,0 1 0,0-1 0,1 1 0,0-1 0,0 1 0,0 0 0,0 0 0,1 0 0,0 1 0,0-1 0,0 1 0,7-6 0,3 0 0,1 1 0,-1 0 0,1 1 0,1 1 0,21-8 0,38-9 0,1 4 0,101-15 0,-74 16 0,202-37 0,-214 41 0,1 5 0,176 1 0,1 1 0,781-14 0,-715 24 0,-314-2 0,295 6 0,-236 0 0,150 29 0,-139-16 0,85 23 0,-170-40 0,-1 0 0,1 0 0,0 1 0,-1 0 0,0 0 0,0 0 0,0 0 0,0 1 0,0 0 0,7 8 0,-9-8 0,-1-1 0,0 1 0,0 0 0,0-1 0,0 1 0,0 0 0,-1 0 0,0 0 0,0 0 0,0 0 0,0 0 0,-1 1 0,1-1 0,-1 0 0,0 0 0,-1 5 0,-1 19 0,2-14 0,-2 1 0,1-1 0,-2 1 0,-4 16 0,4-26 0,1 0 0,0 1 0,-1-1 0,0 0 0,0 0 0,-1 0 0,1-1 0,-1 1 0,0-1 0,-1 0 0,1 0 0,0 0 0,-1-1 0,-5 4 0,-81 46 0,51-31 0,1 2 0,-48 38 0,72-50-227,-1-2-1,0 1 1,-1-2-1,0 0 1,-27 9-1,35-15-6598</inkml:trace>
-  <inkml:trace contextRef="#ctx0" brushRef="#br0" timeOffset="624.3">4322 236 24575,'4'2'0,"0"3"0,3 5 0,0 3 0,-1 3 0,-2 1 0,0 3 0,-1 1 0,-1-4 0,-1 0 0,0-1 0,-1-2 0,0-3-8191</inkml:trace>
+  <inkml:trace contextRef="#ctx0" brushRef="#br0" timeOffset="624.29">4322 236 24575,'4'2'0,"0"3"0,3 5 0,0 3 0,-1 3 0,-2 1 0,0 3 0,-1 1 0,-1-4 0,-1 0 0,0-1 0,-1-2 0,0-3-8191</inkml:trace>
   <inkml:trace contextRef="#ctx0" brushRef="#br0" timeOffset="1417.35">4420 172 24575,'0'-2'0,"-3"0"0,-3 1 0,-6 1 0,-2 1 0,-3 3 0,1 1 0,-1 3 0,0 0 0,2 0 0,1-2 0,1-2 0,2-1 0,0 1 0,3 1 0,2 0-8191</inkml:trace>
   <inkml:trace contextRef="#ctx0" brushRef="#br0" timeOffset="2229.31">4534 284 24575,'0'2'0,"0"0"0,0 4 0,-3 3 0,-2 5 0,-2 1 0,1 3 0,0-1 0,-1-1 0,0-2 0,-1-1 0,2-3-8191</inkml:trace>
   <inkml:trace contextRef="#ctx0" brushRef="#br0" timeOffset="3145.92">4454 312 24575,'1'2'0,"2"3"0,3 2 0,1 4 0,3 3 0,3-2 0,-1 0 0,-1-1 0,-1-2 0,0-1 0,0-3 0,-1 1 0,0 0 0,-2-1-8191</inkml:trace>
@@ -7797,6 +9755,156 @@
 </inkml:ink>
 </file>
 
+<file path=word/ink/ink16.xml><?xml version="1.0" encoding="utf-8"?>
+<inkml:ink xmlns:inkml="http://www.w3.org/2003/InkML">
+  <inkml:definitions>
+    <inkml:context xml:id="ctx0">
+      <inkml:inkSource xml:id="inkSrc0">
+        <inkml:traceFormat>
+          <inkml:channel name="X" type="integer" min="-2.14748E9" max="2.14748E9" units="cm"/>
+          <inkml:channel name="Y" type="integer" min="-2.14748E9" max="2.14748E9" units="cm"/>
+          <inkml:channel name="F" type="integer" max="32767" units="dev"/>
+        </inkml:traceFormat>
+        <inkml:channelProperties>
+          <inkml:channelProperty channel="X" name="resolution" value="1000" units="1/cm"/>
+          <inkml:channelProperty channel="Y" name="resolution" value="1000" units="1/cm"/>
+          <inkml:channelProperty channel="F" name="resolution" value="0" units="1/dev"/>
+        </inkml:channelProperties>
+      </inkml:inkSource>
+      <inkml:timestamp xml:id="ts0" timeString="2026-07-14T07:03:55.972"/>
+    </inkml:context>
+    <inkml:brush xml:id="br0">
+      <inkml:brushProperty name="width" value="0.025" units="cm"/>
+      <inkml:brushProperty name="height" value="0.025" units="cm"/>
+      <inkml:brushProperty name="color" value="#FFC114"/>
+    </inkml:brush>
+  </inkml:definitions>
+  <inkml:trace contextRef="#ctx0" brushRef="#br0">522 890 24575,'6'1'0,"-1"-1"0,1 1 0,-1-1 0,0 2 0,1-1 0,-1 1 0,0-1 0,0 1 0,0 1 0,0-1 0,7 6 0,-9-7 0,-1 1 0,0 0 0,1 0 0,-1 0 0,0 0 0,0 0 0,-1 0 0,1 1 0,0-1 0,-1 1 0,1-1 0,-1 1 0,0 0 0,0-1 0,0 1 0,0 0 0,0 0 0,-1 0 0,1 0 0,-1-1 0,0 1 0,1 0 0,-2 4 0,-5-18 0,0-12 0,6 14-114,-1 1 1,2 0-1,0-1 0,0 1 0,0-1 1,1 1-1,0 0 0,1 0 0,-1 0 1,2 0-1,4-8 0,-1 3-6712</inkml:trace>
+  <inkml:trace contextRef="#ctx0" brushRef="#br0" timeOffset="847.14">720 816 24575,'1'5'0,"0"1"0,0 0 0,1 0 0,0-1 0,0 1 0,0-1 0,4 7 0,-5-10 0,0 0 0,1 0 0,-1 0 0,0-1 0,1 1 0,-1 0 0,1-1 0,-1 1 0,1-1 0,2 2 0,-3-3 0,0 1 0,-1-1 0,1 0 0,0 0 0,-1 1 0,1-1 0,0 0 0,-1 0 0,1 0 0,0 0 0,0 0 0,-1 0 0,1 0 0,0 0 0,-1 0 0,1-1 0,0 1 0,0 0 0,-1 0 0,1-1 0,0 1 0,-1 0 0,1-1 0,-1 1 0,1-1 0,0 1 0,-1 0 0,1-1 0,-1 1 0,1-2 0,1 0 0,0-1 0,0 0 0,-1 0 0,1 0 0,-1 0 0,0-1 0,0 1 0,0 0 0,0 0 0,0-1 0,-1 1 0,1 0 0,-1-5 0,-2-48 0,2 48 0,1 15 0,0 1 0,1-1 0,0 1 0,0-1 0,0 0 0,1 0 0,7 12 0,-10-18 0,1 0 0,0 1 0,0-1 0,0 0 0,-1 1 0,1-1 0,0 0 0,1 0 0,-1 0 0,0 0 0,0 0 0,0 0 0,1 0 0,-1 0 0,0 0 0,1-1 0,-1 1 0,1 0 0,-1-1 0,1 1 0,-1-1 0,1 0 0,-1 1 0,1-1 0,-1 0 0,1 0 0,-1 0 0,1 0 0,0 0 0,-1-1 0,1 1 0,-1 0 0,1-1 0,-1 1 0,1-1 0,-1 1 0,0-1 0,1 0 0,-1 0 0,0 0 0,1 0 0,-1 0 0,0 0 0,0 0 0,0 0 0,0 0 0,0 0 0,2-3 0,6-7-1365,-1 0-5461</inkml:trace>
+  <inkml:trace contextRef="#ctx0" brushRef="#br0" timeOffset="-8526.52">123 366 24575,'0'3'0,"0"2"0,2 9 0,1 3 0,1 7 0,2-1 0,0-3 0,-1-1 0,-2-2 0,-1-1 0,1 0 0,0 0 0,0-1 0,-2 0 0,3-2 0,-1-4 0,0-3-8191</inkml:trace>
+  <inkml:trace contextRef="#ctx0" brushRef="#br0" timeOffset="-7837.6">230 293 24575,'-5'2'0,"-1"1"0,-4 1 0,-3 2 0,-4 2 0,0 0 0,1 2 0,0-2 0,-2 0 0,-6 2 0,2-1 0,1-2 0,4-1 0,2-2 0,2-1-8191</inkml:trace>
+  <inkml:trace contextRef="#ctx0" brushRef="#br0" timeOffset="-6598.24">204 237 24575,'1'0'0,"0"0"0,-1 1 0,1-1 0,0 1 0,0-1 0,0 1 0,0 0 0,0-1 0,0 1 0,-1 0 0,1 0 0,0-1 0,-1 1 0,1 0 0,-1 0 0,1 0 0,-1 0 0,1 0 0,-1 0 0,1 0 0,-1 1 0,10 27 0,-8-23 0,7 21 0,0 0 0,-2 1 0,-1 0 0,-2 0 0,0 0 0,-2 0 0,-2 32 0,1-66 0,0 0 0,1-1 0,0 1 0,0 0 0,0 1 0,1-1 0,-1 0 0,1 1 0,1-1 0,6-8 0,-9 13 0,0 0 0,0-1 0,0 1 0,0 0 0,0 0 0,0 0 0,1 0 0,-1 0 0,0 0 0,1 0 0,-1 1 0,0-1 0,1 0 0,-1 1 0,1-1 0,-1 1 0,1 0 0,0-1 0,-1 1 0,1 0 0,-1 0 0,1 0 0,-1 0 0,1 0 0,0 0 0,-1 0 0,1 1 0,-1-1 0,1 1 0,-1-1 0,1 1 0,-1-1 0,1 1 0,-1 0 0,0 0 0,1 0 0,-1 0 0,0 0 0,0 0 0,0 0 0,0 0 0,0 0 0,0 0 0,0 1 0,0-1 0,1 3 0,14 29 57,-15-29-167,0 0 1,0-1 0,1 1-1,-1-1 1,1 1 0,0-1-1,0 0 1,0 0-1,0 0 1,1 0 0,-1 0-1,4 2 1,2-1-6717</inkml:trace>
+  <inkml:trace contextRef="#ctx0" brushRef="#br0" timeOffset="-5808.66">453 497 24575,'7'-1'0,"0"0"0,0 0 0,0 0 0,0-1 0,0 0 0,0-1 0,0 0 0,11-6 0,-14 7 0,0 0 0,0-1 0,0 1 0,-1-1 0,1 1 0,-1-1 0,0-1 0,0 1 0,0 0 0,0-1 0,-1 1 0,1-1 0,-1 0 0,0 0 0,3-5 0,-5 9 0,0-1 0,0 1 0,0 0 0,0-1 0,0 1 0,0 0 0,0-1 0,0 1 0,0 0 0,0-1 0,0 1 0,0 0 0,0-1 0,0 1 0,0-1 0,0 1 0,0 0 0,0-1 0,0 1 0,0 0 0,-1-1 0,1 1 0,0 0 0,0 0 0,0-1 0,-1 1 0,1 0 0,0-1 0,0 1 0,-1 0 0,1 0 0,0 0 0,0-1 0,-1 1 0,0 0 0,-15 0 0,-15 12 0,28-10 0,0 0 0,0 0 0,0 1 0,0 0 0,0-1 0,1 1 0,0 0 0,-1 0 0,1 0 0,0 1 0,0-1 0,1 0 0,-1 1 0,1-1 0,0 1 0,0 0 0,0-1 0,0 1 0,0 4 0,1-6 0,-1 0 0,1 1 0,0-1 0,0 0 0,0 1 0,1-1 0,-1 0 0,0 0 0,1 1 0,0-1 0,-1 0 0,1 0 0,0 0 0,0 0 0,0 1 0,1-2 0,-1 1 0,0 0 0,1 0 0,-1 0 0,1 0 0,-1-1 0,1 1 0,0-1 0,0 0 0,0 1 0,0-1 0,0 0 0,0 0 0,0 0 0,0 0 0,3 0 0,2 0-41,0 0 0,-1-1 0,1 0 0,0 0-1,0 0 1,-1-1 0,1 0 0,0-1 0,-1 0 0,7-2 0,0 1-872,-4 0-5913</inkml:trace>
+  <inkml:trace contextRef="#ctx0" brushRef="#br0" timeOffset="-3819.9">1218 285 24575,'-4'-1'0,"0"1"0,0-2 0,-1 1 0,1 0 0,0-1 0,0 0 0,1 0 0,-6-3 0,-15-7 0,18 10 0,0 0 0,0 1 0,0-1 0,0 1 0,0 1 0,-1-1 0,1 1 0,0 0 0,0 1 0,0-1 0,0 1 0,-1 0 0,1 1 0,0 0 0,1 0 0,-11 4 0,12-4 0,1 1 0,-1 0 0,0-1 0,1 1 0,-1 0 0,1 1 0,0-1 0,0 0 0,0 1 0,0 0 0,1 0 0,0 0 0,0 0 0,0 0 0,0 0 0,0 0 0,1 1 0,0-1 0,0 1 0,0-1 0,0 1 0,1 8 0,-1-4 0,1 1 0,0 0 0,1 0 0,0 0 0,1-1 0,0 1 0,0 0 0,6 13 0,-7-21 0,1 1 0,-1 0 0,1 0 0,0-1 0,0 1 0,0-1 0,0 0 0,0 1 0,1-1 0,-1 0 0,1 0 0,-1-1 0,1 1 0,0 0 0,0-1 0,0 0 0,0 1 0,0-1 0,0 0 0,0-1 0,0 1 0,0-1 0,0 1 0,0-1 0,1 0 0,-1 0 0,0 0 0,0 0 0,6-2 0,-1 0-9,-1 0-1,0 0 0,0-1 1,0 0-1,0 0 1,0-1-1,-1 0 1,0 0-1,12-9 0,5-4-1259,-10 9-5557</inkml:trace>
+  <inkml:trace contextRef="#ctx0" brushRef="#br0" timeOffset="-3013.16">1350 355 24575,'-2'1'0,"1"0"0,-1 1 0,0-1 0,1 1 0,-1 0 0,1-1 0,0 1 0,0 0 0,-1 0 0,1 0 0,0 0 0,0 0 0,1 0 0,-1 0 0,0 0 0,1 0 0,-1 0 0,1 0 0,0 0 0,0 1 0,0-1 0,0 0 0,0 0 0,0 0 0,0 0 0,1 1 0,-1-1 0,1 0 0,-1 0 0,1 0 0,0 0 0,1 2 0,-1-2 0,-1 0 0,1 0 0,0 0 0,0 0 0,0 0 0,0-1 0,0 1 0,0 0 0,1-1 0,-1 1 0,0 0 0,1-1 0,-1 0 0,1 1 0,0-1 0,-1 0 0,1 0 0,0 0 0,0 0 0,0 0 0,0 0 0,0 0 0,0-1 0,0 1 0,0-1 0,0 0 0,0 1 0,0-1 0,0 0 0,0 0 0,0 0 0,0-1 0,0 1 0,3-1 0,-4 0 0,0 1 0,0-1 0,0 0 0,0 1 0,0-1 0,0 0 0,0 0 0,0 0 0,-1 0 0,1 0 0,0 0 0,-1 0 0,1 0 0,-1 0 0,1 0 0,-1 0 0,1 0 0,-1-1 0,0 1 0,0 0 0,0 0 0,1 0 0,-1 0 0,0-2 0,-3-37 0,1 20 0,5 25 0,-1 0 0,0 0 0,1 0 0,0 0 0,0-1 0,5 6 0,-4-4 0,-2-3-136,0-1-1,0 1 1,1-1-1,-1 1 1,0-1-1,1 0 1,0 0-1,-1 0 0,5 2 1,2 0-6690</inkml:trace>
+  <inkml:trace contextRef="#ctx0" brushRef="#br0" timeOffset="-2276.73">1492 355 24575,'2'5'0,"-1"0"0,1-1 0,-1 1 0,2 0 0,-1-1 0,0 1 0,1-1 0,0 0 0,0 0 0,6 7 0,-9-11 0,0 0 0,0 0 0,1 0 0,-1 1 0,0-1 0,0 0 0,1 0 0,-1 0 0,0 0 0,0 0 0,1 0 0,-1 0 0,0 0 0,0 0 0,1 0 0,-1 0 0,0 0 0,0 0 0,1 0 0,-1 0 0,0 0 0,0 0 0,1 0 0,-1 0 0,0 0 0,0 0 0,1 0 0,-1-1 0,0 1 0,0 0 0,1 0 0,-1 0 0,0 0 0,0-1 0,1 1 0,8-13 0,5-21 0,-12 28 0,3-7 0,-4 8 0,1 0 0,0 0 0,0 1 0,0-1 0,0 1 0,0-1 0,1 1 0,0 0 0,0 0 0,7-7 0,-10 11 0,1-1 0,-1 1 0,1 0 0,-1 0 0,1-1 0,-1 1 0,1 0 0,-1 0 0,1 0 0,-1 0 0,1-1 0,-1 1 0,1 0 0,0 0 0,-1 0 0,1 0 0,-1 0 0,1 0 0,-1 0 0,1 1 0,-1-1 0,1 0 0,-1 0 0,1 0 0,-1 0 0,1 1 0,-1-1 0,1 0 0,-1 1 0,2 0 0,7 17 0,-4 23 0,-5-39 11,0 1 0,0-1 0,0 0 0,0 1 0,1-1 0,-1 0-1,1 0 1,-1 1 0,1-1 0,2 4 0,-3-6-68,1 1 0,0 0 0,-1 0 0,1-1-1,0 1 1,0 0 0,0-1 0,0 1 0,0-1 0,-1 1 0,1-1 0,0 1-1,0-1 1,0 0 0,0 1 0,0-1 0,0 0 0,0 0 0,1 0 0,-1 0 0,0 0-1,0 0 1,0 0 0,0 0 0,1 0 0,10-3-6769</inkml:trace>
+  <inkml:trace contextRef="#ctx0" brushRef="#br0" timeOffset="-1854.41">1705 255 24575,'0'2'0,"0"3"0,0 4 0,0 3 0,0 1 0,0 2 0,0 0 0,1 3 0,2-1 0,3-1 0,0-3 0,2-5 0,2-5 0,0-3-8191</inkml:trace>
+  <inkml:trace contextRef="#ctx0" brushRef="#br0" timeOffset="-1428.18">1773 323 24575,'-2'0'0,"-2"0"0,-1 0 0,-2 0 0,-1 0 0,-1 0 0,0 0 0,1 1 0,-2 1 0,2 1 0,0-1-8191</inkml:trace>
+  <inkml:trace contextRef="#ctx0" brushRef="#br0" timeOffset="-987.99">1624 0 24575,'-2'4'0,"-1"3"0,0 3 0,1 1 0,0 3 0,-3 0 0,-1-2 0,1 0 0,1-1 0,1-1 0,0 0 0,-2 1 0,1 0 0,-2 2 0,-1 2 0,1-2-8191</inkml:trace>
+  <inkml:trace contextRef="#ctx0" brushRef="#br0">522 890 24575,'6'1'0,"-1"-1"0,1 1 0,-1-1 0,0 2 0,1-1 0,-1 1 0,0-1 0,0 1 0,0 1 0,0-1 0,7 6 0,-9-7 0,-1 1 0,0 0 0,1 0 0,-1 0 0,0 0 0,0 0 0,-1 0 0,1 1 0,0-1 0,-1 1 0,1-1 0,-1 1 0,0 0 0,0-1 0,0 1 0,0 0 0,0 0 0,-1 0 0,1 0 0,-1-1 0,0 1 0,1 0 0,-2 4 0,-5-18 0,0-12 0,6 14-114,-1 1 1,2 0-1,0-1 0,0 1 0,0-1 1,1 1-1,0 0 0,1 0 0,-1 0 1,2 0-1,4-8 0,-1 3-6712</inkml:trace>
+  <inkml:trace contextRef="#ctx0" brushRef="#br0" timeOffset="847.14">720 816 24575,'1'5'0,"0"1"0,0 0 0,1 0 0,0-1 0,0 1 0,0-1 0,4 7 0,-5-10 0,0 0 0,1 0 0,-1 0 0,0-1 0,1 1 0,-1 0 0,1-1 0,-1 1 0,1-1 0,2 2 0,-3-3 0,0 1 0,-1-1 0,1 0 0,0 0 0,-1 1 0,1-1 0,0 0 0,-1 0 0,1 0 0,0 0 0,0 0 0,-1 0 0,1 0 0,0 0 0,-1 0 0,1-1 0,0 1 0,0 0 0,-1 0 0,1-1 0,0 1 0,-1 0 0,1-1 0,-1 1 0,1-1 0,0 1 0,-1 0 0,1-1 0,-1 1 0,1-2 0,1 0 0,0-1 0,0 0 0,-1 0 0,1 0 0,-1 0 0,0-1 0,0 1 0,0 0 0,0 0 0,0-1 0,-1 1 0,1 0 0,-1-5 0,-2-48 0,2 48 0,1 15 0,0 1 0,1-1 0,0 1 0,0-1 0,0 0 0,1 0 0,7 12 0,-10-18 0,1 0 0,0 1 0,0-1 0,0 0 0,-1 1 0,1-1 0,0 0 0,1 0 0,-1 0 0,0 0 0,0 0 0,0 0 0,1 0 0,-1 0 0,0 0 0,1-1 0,-1 1 0,1 0 0,-1-1 0,1 1 0,-1-1 0,1 0 0,-1 1 0,1-1 0,-1 0 0,1 0 0,-1 0 0,1 0 0,0 0 0,-1-1 0,1 1 0,-1 0 0,1-1 0,-1 1 0,1-1 0,-1 1 0,0-1 0,1 0 0,-1 0 0,0 0 0,1 0 0,-1 0 0,0 0 0,0 0 0,0 0 0,0 0 0,0 0 0,2-3 0,6-7-1365,-1 0-5461</inkml:trace>
+  <inkml:trace contextRef="#ctx0" brushRef="#br0" timeOffset="1627.02">901 797 24575,'0'0'0,"1"-1"0,-1 1 0,1 0 0,-1 0 0,1 0 0,-1 0 0,1 0 0,-1 0 0,0 0 0,1 0 0,-1 0 0,1 0 0,-1 0 0,1 0 0,-1 0 0,1 0 0,-1 1 0,1-1 0,-1 0 0,0 0 0,1 0 0,-1 1 0,1-1 0,-1 0 0,0 1 0,1-1 0,-1 0 0,0 1 0,1-1 0,-1 0 0,0 1 0,0-1 0,1 0 0,-1 1 0,0-1 0,0 1 0,0-1 0,1 1 0,-1-1 0,0 1 0,0-1 0,0 1 0,12 28 0,-9-21 0,-2-6 0,-1-1 0,1 0 0,-1 1 0,1-1 0,0 0 0,-1 0 0,1 0 0,0 0 0,0 0 0,0 0 0,0 0 0,0 0 0,0 0 0,2 1 0,-3-2 0,1 0 0,-1 0 0,1 0 0,-1 0 0,1 0 0,-1 0 0,1 0 0,-1 0 0,0 0 0,1 0 0,-1 0 0,1 0 0,-1 0 0,1-1 0,-1 1 0,0 0 0,1 0 0,-1 0 0,1-1 0,-1 1 0,0 0 0,1-1 0,-1 1 0,0 0 0,0-1 0,1 1 0,-1 0 0,1-1 0,2-5 0,0 0 0,0 0 0,-1-1 0,3-10 0,0 4 0,-2 6 0,0 0 0,1 0 0,0 0 0,0 0 0,6-6 0,-9 11 0,0 1 0,1-1 0,-1 1 0,0 0 0,1-1 0,-1 1 0,1 0 0,0 0 0,-1 0 0,1 0 0,0 1 0,2-2 0,-4 2 0,1 0 0,0 0 0,0 0 0,0 0 0,0 0 0,0 0 0,0 0 0,0 1 0,0-1 0,0 0 0,-1 0 0,1 1 0,0-1 0,0 0 0,0 1 0,0-1 0,-1 1 0,1-1 0,0 1 0,0 0 0,-1-1 0,1 1 0,-1 0 0,1-1 0,0 1 0,0 1 0,1 2 19,0-1 0,-1 1 0,1-1 0,-1 1 0,0 0 0,2 8 0,5 13-1517,-4-17-5328</inkml:trace>
+  <inkml:trace contextRef="#ctx0" brushRef="#br0" timeOffset="2915.77">1431 852 24575,'-15'-9'0,"0"1"0,-1 1 0,-32-11 0,36 15 0,1-1 0,-1-1 0,1 0 0,-1 0 0,2-1 0,-1 0 0,1-1 0,-1 0 0,-10-11 0,20 17 0,0 0 0,1 1 0,-1-1 0,0 0 0,1 0 0,-1 0 0,1 0 0,-1 0 0,1-1 0,-1 1 0,1 0 0,0 0 0,-1 0 0,1 0 0,0 0 0,0 0 0,0-1 0,0 1 0,0 0 0,0 0 0,0 0 0,1 0 0,-1-1 0,0 1 0,1 0 0,-1 0 0,0 0 0,1 0 0,-1 0 0,1 0 0,1-1 0,0-1 0,0 1 0,0-1 0,0 1 0,1 0 0,-1-1 0,1 1 0,0 1 0,0-1 0,-1 0 0,1 1 0,5-2 0,-6 2 0,0 0 0,0 0 0,0 0 0,1 1 0,-1-1 0,0 1 0,0 0 0,1 0 0,-1 0 0,0 0 0,1 0 0,-1 0 0,0 0 0,0 1 0,4 0 0,-5 0 0,0 0 0,0-1 0,0 1 0,0 0 0,0 0 0,0 0 0,-1 0 0,1 0 0,0 0 0,-1 0 0,1 0 0,0 0 0,-1 0 0,0 0 0,1 0 0,-1 0 0,1 0 0,-1 1 0,0-1 0,0 0 0,0 0 0,0 0 0,0 1 0,0-1 0,0 0 0,0 0 0,0 0 0,0 0 0,-1 1 0,1-1 0,-1 0 0,0 1 0,-17 38 0,15-36 0,0 1 0,0-1 0,1 0 0,0 1 0,0 0 0,0-1 0,1 1 0,-1 0 0,1 0 0,0 0 0,1 0 0,-1 8 0,1-12 0,0-1 0,0 1 0,0 0 0,0-1 0,0 1 0,1-1 0,-1 1 0,0-1 0,0 1 0,0-1 0,1 1 0,-1 0 0,0-1 0,1 1 0,-1-1 0,0 0 0,1 1 0,-1-1 0,0 1 0,1-1 0,-1 0 0,1 1 0,-1-1 0,1 0 0,-1 1 0,1-1 0,-1 0 0,1 0 0,-1 1 0,2-1 0,15-7 0,-13 3 0,0 1 0,0-1 0,-1 1 0,1-1 0,5-9 0,2-9-1365,-6 12-5461</inkml:trace>
+  <inkml:trace contextRef="#ctx0" brushRef="#br0" timeOffset="3959.05">1542 678 24575,'4'2'0,"0"1"0,0 0 0,0 0 0,-1 1 0,1-1 0,-1 1 0,0-1 0,0 1 0,0 0 0,0 1 0,-1-1 0,3 5 0,-3-4 0,1 0 0,-1-1 0,1 1 0,0-1 0,1 1 0,-1-1 0,1-1 0,5 6 0,-9-9 0,1 0 0,0 0 0,-1 0 0,1 0 0,-1 0 0,1 1 0,0-1 0,-1 0 0,1 0 0,-1 0 0,1-1 0,0 1 0,-1 0 0,1 0 0,-1 0 0,1 0 0,0-1 0,-1 1 0,1 0 0,-1 0 0,1-1 0,-1 1 0,1 0 0,-1-1 0,1 1 0,-1-1 0,0 1 0,1 0 0,-1-1 0,1 1 0,-1-1 0,0 0 0,1 1 0,-1-1 0,0 1 0,0-1 0,1 1 0,-1-1 0,0 0 0,0 1 0,0-1 0,0 0 0,8-28 0,-6-11-1365,-2 30-5461</inkml:trace>
+  <inkml:trace contextRef="#ctx0" brushRef="#br0" timeOffset="4871.09">1748 623 24575,'-3'0'0,"1"0"0,-1 1 0,1-1 0,-1 0 0,1 1 0,-1-1 0,1 1 0,-1 0 0,1 0 0,0 0 0,0 0 0,-1 0 0,1 0 0,0 1 0,0-1 0,0 1 0,0-1 0,0 1 0,1 0 0,-1 0 0,0 0 0,1 0 0,0 0 0,-1 0 0,1 0 0,0 0 0,0 1 0,0-1 0,0 0 0,0 1 0,1-1 0,-1 5 0,0-4 0,1 0 0,0 0 0,0 0 0,0 0 0,0 1 0,1-1 0,-1 0 0,1 0 0,0 0 0,0 0 0,0 0 0,0-1 0,0 1 0,1 0 0,-1 0 0,1-1 0,0 1 0,-1-1 0,1 1 0,1-1 0,-1 0 0,0 0 0,0 0 0,1 0 0,-1 0 0,4 1 0,-5-2 0,0-1 0,0 1 0,-1-1 0,1 1 0,0-1 0,0 0 0,0 0 0,0 1 0,0-1 0,0 0 0,-1 0 0,1 0 0,0 0 0,0 0 0,0 0 0,0 0 0,0 0 0,0 0 0,0-1 0,0 1 0,-1 0 0,1 0 0,0-1 0,0 1 0,0-1 0,0 1 0,-1-1 0,1 1 0,0-1 0,0 0 0,15-27 0,-2 2 0,-13 26 0,-1-1 0,1 0 0,-1 1 0,1-1 0,0 0 0,0 1 0,-1-1 0,1 1 0,0-1 0,0 1 0,-1-1 0,1 1 0,0 0 0,0-1 0,0 1 0,0 0 0,0 0 0,-1 0 0,1-1 0,0 1 0,0 0 0,0 0 0,0 0 0,2 1 0,12 3-1365,-8-3-5461</inkml:trace>
+  <inkml:trace contextRef="#ctx0" brushRef="#br0" timeOffset="5421.08">1879 474 24575,'0'1'0,"0"2"0,0 3 0,1 3 0,1 6 0,-1 0 0,0 0 0,2 1 0,0-2 0,0 0 0,0-3 0,-2-1 0,0 0 0,1 1 0,-1-1 0,0-1-8191</inkml:trace>
+  <inkml:trace contextRef="#ctx0" brushRef="#br0" timeOffset="21421.44">640 392 24575,'3'2'0,"0"0"0,-1-1 0,1 1 0,-1 0 0,1 0 0,-1 1 0,1-1 0,3 6 0,11 9 0,-14-15 0,0 0 0,-1 0 0,1-1 0,0 1 0,0-1 0,0 0 0,0 0 0,1 0 0,5 1 0,-8-2 0,0 0 0,-1 0 0,1 0 0,0 0 0,0 0 0,0-1 0,0 1 0,-1 0 0,1-1 0,0 1 0,0-1 0,-1 1 0,1-1 0,0 1 0,-1-1 0,1 1 0,0-1 0,-1 1 0,1-1 0,-1 0 0,1 1 0,-1-1 0,1 0 0,-1 0 0,0 1 0,1-1 0,-1 0 0,0 0 0,0 0 0,1 0 0,-1 1 0,0-1 0,0 0 0,0 0 0,0 0 0,0 0 0,0 0 0,0 1 0,-1-3 0,5 12 24,0-1 0,-1 1 0,0-1 0,3 16 0,-6-22-39,1 1-1,-1 0 1,0 0-1,0-1 1,0 1-1,0 0 1,0-1-1,0 1 1,-1 0-1,1 0 1,-1-1-1,-2 5 1,3-6-34,-1 0-1,0 1 1,0-1-1,0 0 1,0 0 0,-1 0-1,1 0 1,0 0 0,0 0-1,-1 0 1,1-1-1,0 1 1,-1 0 0,1-1-1,-1 1 1,1-1-1,-1 1 1,1-1 0,-1 0-1,1 0 1,-1 0-1,1 0 1,-1 0 0,1 0-1,-3 0 1,-7-1-6777</inkml:trace>
+  <inkml:trace contextRef="#ctx0" brushRef="#br0" timeOffset="22624.95">1961 554 24575,'1'0'0,"3"2"0,2 2 0,1 4 0,1 1 0,-1 2 0,0 3 0,-1 1 0,-1 0 0,-2-4 0,-1-4-8191</inkml:trace>
+  <inkml:trace contextRef="#ctx0" brushRef="#br0" timeOffset="22847.71">1940 431 24575,'0'-1'0</inkml:trace>
+  <inkml:trace contextRef="#ctx0" brushRef="#br0" timeOffset="24217.76">2072 499 24575,'-2'0'0,"1"0"0,0 0 0,0 0 0,-1 1 0,1-1 0,0 0 0,0 0 0,0 1 0,-1-1 0,1 1 0,0-1 0,0 1 0,0-1 0,0 1 0,0 0 0,0-1 0,0 1 0,0 0 0,0 0 0,0 0 0,0 0 0,1 0 0,-1 0 0,-1 1 0,1 1 0,0-1 0,1 0 0,-1 1 0,1-1 0,-1 0 0,1 1 0,0-1 0,-1 1 0,1-1 0,0 1 0,1-1 0,-1 3 0,1-1 0,-1-1 0,1 1 0,0-1 0,0 1 0,0-1 0,0 0 0,1 0 0,-1 0 0,1 0 0,0 0 0,0 0 0,0 0 0,0 0 0,1-1 0,-1 1 0,1-1 0,-1 1 0,5 2 0,-6-5 0,0 1 0,-1-1 0,1 0 0,-1 0 0,1 0 0,0 1 0,-1-1 0,1 0 0,0 0 0,-1 0 0,1 0 0,0 0 0,-1 0 0,1 0 0,-1 0 0,1-1 0,0 1 0,-1 0 0,1 0 0,0 0 0,-1-1 0,1 1 0,-1 0 0,1-1 0,-1 1 0,1 0 0,0-1 0,8-19 0,-7-29 0,-3 44 0,0-9 0,0 0 0,-8-26 0,0-9 0,15 70 0,2-2 0,0 1 0,20 34 0,-21-41 0,-4-8 17,0 0 0,0 0 1,1 0-1,-1-1 0,1 1 0,5 4 0,-8-8-68,0 0 0,0 0-1,0 0 1,1 0 0,-1-1 0,0 1 0,0 0-1,1 0 1,-1-1 0,1 1 0,-1-1 0,0 1-1,1-1 1,-1 0 0,1 0 0,-1 0-1,1 1 1,-1-1 0,1 0 0,-1-1 0,1 1-1,-1 0 1,1 0 0,-1-1 0,1 1 0,-1-1-1,0 1 1,3-2 0,4-3-6775</inkml:trace>
+  <inkml:trace contextRef="#ctx0" brushRef="#br0" timeOffset="25218.17">2282 435 24575,'-7'30'0,"-5"19"0,12-47 0,-1 1 0,1-1 0,0 1 0,0 0 0,0-1 0,0 1 0,0 0 0,1-1 0,-1 1 0,1 0 0,0-1 0,-1 1 0,1-1 0,2 5 0,-2-7 0,-1 1 0,1 0 0,-1 0 0,0-1 0,1 1 0,-1 0 0,1-1 0,0 1 0,-1 0 0,1-1 0,-1 1 0,1-1 0,0 1 0,0-1 0,-1 1 0,1-1 0,0 0 0,0 1 0,-1-1 0,1 0 0,0 0 0,0 1 0,0-1 0,0 0 0,-1 0 0,1 0 0,0 0 0,0 0 0,0 0 0,0 0 0,0 0 0,-1-1 0,1 1 0,0 0 0,0 0 0,0-1 0,-1 1 0,1-1 0,0 1 0,-1 0 0,1-1 0,0 1 0,0-1 0,-1 0 0,1 1 0,-1-1 0,1 1 0,-1-1 0,1 0 0,-1 0 0,1 1 0,-1-1 0,1-1 0,1-2 0,0 0 0,0 0 0,0 0 0,0 0 0,-1-1 0,1 1 0,-1 0 0,1-9 0,-6-35 0,4 44 0,2 16 0,0 0 0,-2-10 6,1 1 0,-1 0 0,1 0 0,0-1 0,0 1 0,0-1 0,0 1 0,0-1 0,0 1 0,1-1 0,-1 0 0,1 1 0,0-1 0,0 0 0,0 0 0,0 0 0,0 0 0,0-1 0,4 3 0,-4-3-74,1 0 1,-1 0-1,1-1 1,-1 1-1,1-1 1,0 0-1,-1 0 1,1 0-1,-1 0 1,1 0-1,-1 0 1,1-1-1,-1 1 1,1-1-1,-1 0 1,1 0-1,-1 0 1,0 0-1,1 0 1,-1 0-1,3-3 1,4-2-6759</inkml:trace>
+  <inkml:trace contextRef="#ctx0" brushRef="#br0" timeOffset="25702.88">2452 373 24575,'0'3'0,"0"3"0,0 2 0,1 5 0,1 2 0,-1-1 0,0-1 0,2 3 0,2 0 0,1-3 0,4-4 0,0-4 0,0-7 0,-3-2 0,-3-5 0,-1-3 0,-2-1-8191</inkml:trace>
+  <inkml:trace contextRef="#ctx0" brushRef="#br0" timeOffset="26100.29">2514 405 24575,'-2'0'0,"-2"0"0,-1 0 0,-3 0 0,1 0 0,-2 0 0,-1 0 0,0 1 0,-2 1 0,0 2 0,1 2 0,0 0 0,3-1-8191</inkml:trace>
+  <inkml:trace contextRef="#ctx0" brushRef="#br0" timeOffset="27133.9">2620 417 24575,'4'0'0,"1"-1"0,-1 0 0,1 0 0,-1 0 0,0 0 0,0-1 0,1 0 0,-1 0 0,0 0 0,0-1 0,-1 1 0,5-4 0,-5 4 0,-1 1 0,0-1 0,0 0 0,0 0 0,0 0 0,0 0 0,-1 0 0,1 0 0,0-1 0,-1 1 0,0-1 0,0 1 0,1-1 0,-1 1 0,-1-1 0,1 1 0,0-1 0,-1 0 0,1 1 0,-1-1 0,0-3 0,0 5 0,-1 0 0,1 0 0,-1-1 0,0 1 0,0 0 0,1 0 0,-1 0 0,0 0 0,0 0 0,0 0 0,0 0 0,0 1 0,0-1 0,0 0 0,0 0 0,0 1 0,0-1 0,-1 1 0,1-1 0,0 1 0,0 0 0,-1-1 0,1 1 0,0 0 0,0 0 0,-1 0 0,1 0 0,0 0 0,-1 0 0,1 0 0,0 0 0,0 0 0,-1 1 0,-1 0 0,-2-1 0,-1 1 0,1 0 0,-1 1 0,1-1 0,0 1 0,-10 5 0,13-5 0,0 0 0,0 1 0,0-1 0,0 1 0,0 0 0,0-1 0,0 1 0,1 0 0,0 0 0,-1 0 0,1 0 0,0 0 0,0 0 0,1 0 0,-1 0 0,1 1 0,-1 4 0,1-3 0,0 0 0,0 0 0,0 0 0,0 0 0,1 0 0,0 0 0,0 0 0,0-1 0,0 1 0,1 0 0,2 4 0,-3-7 5,1-1-1,-1 0 0,0 1 0,1-1 1,-1 0-1,1 0 0,-1 0 0,1 0 1,0 0-1,-1 0 0,1 0 1,0 0-1,0-1 0,-1 1 0,1-1 1,0 1-1,0-1 0,0 0 0,0 0 1,0 0-1,0 0 0,0 0 1,0 0-1,-1 0 0,1-1 0,0 1 1,2-1-1,0 0-110,-1 0 0,1 0 0,-1-1 0,1 1 0,-1-1 0,0 1-1,1-1 1,-1 0 0,0 0 0,0-1 0,-1 1 0,1 0 0,3-4 0,-1-4-6720</inkml:trace>
+  <inkml:trace contextRef="#ctx0" brushRef="#br0" timeOffset="28404.46">1474 1170 24575,'0'-4'0,"1"1"0,-1 0 0,1-1 0,0 1 0,0 0 0,0 0 0,1-1 0,-1 1 0,1 0 0,-1 0 0,1 1 0,0-1 0,0 0 0,0 1 0,1-1 0,-1 1 0,3-3 0,-3 4 0,-1 0 0,0 0 0,0 0 0,0 1 0,0-1 0,1 0 0,-1 1 0,0-1 0,1 0 0,-1 1 0,1 0 0,-1-1 0,0 1 0,1 0 0,-1 0 0,1 0 0,-1 0 0,1 0 0,-1 0 0,1 0 0,-1 0 0,0 1 0,1-1 0,-1 0 0,1 1 0,-1-1 0,0 1 0,1 0 0,-1-1 0,0 1 0,0 0 0,0 0 0,1 0 0,-1 0 0,0 0 0,0 0 0,0 0 0,-1 0 0,1 0 0,0 1 0,1 0 0,-1 1 4,0-1 1,0 0-1,0 0 0,0 1 0,0-1 0,0 0 0,-1 1 0,1-1 0,-1 1 1,0-1-1,0 1 0,0-1 0,0 0 0,0 1 0,0-1 0,0 1 0,-1-1 1,0 1-1,1-1 0,-1 0 0,0 1 0,0-1 0,0 0 0,0 0 0,-1 0 1,1 1-1,0-2 0,-3 4 0,2-4-40,1 1 0,0-1-1,0 0 1,-1 0 0,1 0 0,-1 0-1,1 0 1,-1-1 0,1 1 0,-1 0 0,0-1-1,1 1 1,-1-1 0,0 1 0,1-1-1,-1 0 1,0 0 0,0 0 0,1 0 0,-1 0-1,0 0 1,1 0 0,-1 0 0,0-1-1,1 1 1,-1-1 0,0 1 0,1-1 0,-1 0-1,1 0 1,-1 1 0,1-1 0,-1 0 0,1 0-1,0-1 1,-1 1 0,1 0 0,0 0-1,0-1 1,-2-2 0,-3-4-6790</inkml:trace>
+  <inkml:trace contextRef="#ctx0" brushRef="#br0" timeOffset="29400.9">1598 1090 24575,'1'1'0,"0"0"0,0-1 0,0 1 0,0 0 0,0 0 0,0 1 0,0-1 0,-1 0 0,1 0 0,-1 0 0,1 0 0,0 1 0,-1-1 0,0 0 0,1 1 0,-1-1 0,0 0 0,0 0 0,0 1 0,0-1 0,0 3 0,2 10 0,28-50 0,-29 34 9,1 1 1,-1-1-1,0 1 0,1-1 0,-1 1 1,1 0-1,0-1 0,-1 1 0,1 0 0,0 0 1,0 1-1,2-2 0,-3 2-62,0 0 0,0 0 0,0 0 0,0 0 0,0 0 0,0 1 0,0-1 0,-1 0 0,1 1 0,0-1 0,0 0 0,0 1 0,0-1-1,-1 1 1,1 0 0,0-1 0,-1 1 0,1-1 0,0 1 0,-1 0 0,1 0 0,-1-1 0,1 1 0,-1 0 0,1 0 0,-1 0 0,1 1 0,4 6-6773</inkml:trace>
+  <inkml:trace contextRef="#ctx0" brushRef="#br0" timeOffset="30132.65">1991 934 24575,'-1'2'0,"0"0"0,0 0 0,0 1 0,0-1 0,1 0 0,-1 0 0,1 1 0,-1-1 0,1 1 0,0-1 0,0 0 0,1 5 0,-1-5 0,-1 7 0,1-1 0,0 1 0,0-1 0,0 0 0,1 0 0,2 9 0,-3-16 0,1 1 0,-1-1 0,0 0 0,1 0 0,-1 1 0,1-1 0,0 0 0,-1 0 0,1 0 0,0 0 0,0 0 0,-1 0 0,1 0 0,0 0 0,0 0 0,0 0 0,0 0 0,0-1 0,1 1 0,-1 0 0,0-1 0,0 1 0,0-1 0,1 1 0,-1-1 0,0 0 0,0 1 0,1-1 0,-1 0 0,0 0 0,1 0 0,-1 0 0,0 0 0,1 0 0,-1 0 0,0-1 0,1 1 0,-1 0 0,2-1 0,-2 0 6,1 1 0,-1-1 0,1 0 0,-1 0 0,1 1 0,-1-1 0,0 0 0,1 0 0,-1 0 0,0-1 0,0 1 0,0 0 0,0 0 0,0-1 0,0 1 0,0 0 0,0-1 0,0 1 0,0-3 0,6-32-1491,-7 26-5341</inkml:trace>
+  <inkml:trace contextRef="#ctx0" brushRef="#br0" timeOffset="30479.72">2059 965 24575,'0'-2'0,"-2"0"0,-4 2 0,-2 1 0,-3 2 0,-1 1 0,0 3 0,-1 0 0,2-1 0,2-2 0,-1 0 0,1-2 0,2 0-8191</inkml:trace>
+  <inkml:trace contextRef="#ctx0" brushRef="#br0" timeOffset="31722.6">2066 852 24575,'4'5'0,"0"0"0,-1 0 0,0 0 0,0 1 0,0-1 0,0 1 0,-1-1 0,0 1 0,-1 0 0,1 0 0,-1 0 0,0 0 0,0 9 0,9 35 0,-9-50 0,-1 0 0,0 0 0,1 0 0,-1 0 0,0 1 0,0-1 0,1 0 0,-1 0 0,0 0 0,0 0 0,1 0 0,-1 0 0,0-1 0,1 1 0,-1 0 0,0 0 0,0 0 0,1 0 0,-1 0 0,0 0 0,0 0 0,1 0 0,-1-1 0,0 1 0,0 0 0,1 0 0,-1 0 0,0-1 0,0 1 0,0 0 0,0 0 0,1 0 0,-1-1 0,0 1 0,0 0 0,0 0 0,0-1 0,0 1 0,0 0 0,0-1 0,0 1 0,1 0 0,-1 0 0,0-1 0,14-23 0,-3 6 0,-10 18 3,-1-1 0,1 0 0,-1 0 0,1 0 0,0 1 0,-1-1 0,1 0 0,0 0 0,0 1 0,-1-1 0,1 1 0,0-1 0,0 1 0,0-1 0,0 1 0,0 0 0,0-1 0,0 1 0,0 0 0,0 0 0,0 0 0,0-1 0,0 1 0,0 0 0,0 0 0,0 0 0,0 1 0,0-1 0,0 0 0,0 0 0,-1 1 0,1-1 0,0 0 0,0 1 0,0-1 0,0 1 0,0-1 0,0 1 0,0 0 0,3 2-215,-1 1 0,0-1 0,0 1-1,0 0 1,-1 0 0,5 7 0,-2-2-6614</inkml:trace>
+  <inkml:trace contextRef="#ctx0" brushRef="#br0" timeOffset="49531.41">2313 933 24575,'8'-2'0,"0"0"0,0-1 0,0 0 0,0 0 0,10-6 0,-17 8 0,1 0 0,0-1 0,0 1 0,0 0 0,-1-1 0,1 0 0,-1 1 0,1-1 0,-1 0 0,0 0 0,0 1 0,0-1 0,0 0 0,0 0 0,0-1 0,0 1 0,-1 0 0,1 0 0,-1 0 0,1 0 0,-1 0 0,0-1 0,0 1 0,0 0 0,0 0 0,-1-3 0,1 4 0,0 0 0,0-1 0,0 1 0,0 0 0,-1 0 0,1 0 0,-1 0 0,1 0 0,0 0 0,-1 0 0,0 0 0,1 0 0,-1 1 0,1-1 0,-1 0 0,0 0 0,0 0 0,0 1 0,1-1 0,-1 0 0,0 1 0,0-1 0,0 1 0,0-1 0,0 1 0,0-1 0,0 1 0,0 0 0,0-1 0,0 1 0,0 0 0,0 0 0,-1 0 0,1 0 0,0 0 0,0 0 0,0 0 0,0 0 0,0 0 0,0 1 0,0-1 0,0 0 0,0 1 0,0-1 0,0 1 0,0-1 0,-2 2 0,0-1 0,0 1 0,-1 0 0,1 0 0,0 0 0,0 0 0,0 0 0,1 0 0,-1 1 0,0 0 0,1-1 0,0 1 0,-1 0 0,-2 5 0,4-3 0,-1 1 0,0-1 0,1 0 0,0 1 0,0-1 0,1 1 0,-1-1 0,1 1 0,1-1 0,0 11 0,0-14 0,-1 0 0,1 0 0,-1 0 0,1 0 0,0 0 0,0-1 0,0 1 0,0 0 0,0 0 0,0 0 0,0-1 0,1 1 0,-1-1 0,1 1 0,-1-1 0,1 1 0,-1-1 0,1 0 0,0 0 0,0 0 0,0 0 0,-1 0 0,1 0 0,0 0 0,0-1 0,0 1 0,0-1 0,0 0 0,0 1 0,3-1 0,5 0-105,0-1 0,1-1 0,-1 0 0,0 0 0,0-1 0,0 0 0,0 0 0,-1-1 0,1-1 0,-1 0 0,0 0 0,11-9 0,-10 8-6721</inkml:trace>
+  <inkml:trace contextRef="#ctx0" brushRef="#br0" timeOffset="50089.21">2510 830 24575,'2'1'0,"1"2"0,0 2 0,1 2 0,0 1 0,0 2 0,0 1 0,-2-2 0,1 2 0,0-2-8191</inkml:trace>
+  <inkml:trace contextRef="#ctx0" brushRef="#br0" timeOffset="50375.71">2491 763 24575,'0'0'-8191</inkml:trace>
+  <inkml:trace contextRef="#ctx0" brushRef="#br0" timeOffset="51285.5">2570 825 24575,'4'0'0,"0"1"0,0-1 0,0 1 0,0 0 0,0 0 0,0 0 0,0 0 0,-1 1 0,1 0 0,-1 0 0,1 0 0,4 3 0,-6-4 0,-1 1 0,1-1 0,-1 0 0,1 0 0,-1 1 0,0-1 0,0 1 0,0-1 0,0 1 0,0 0 0,0-1 0,0 1 0,0 0 0,-1 0 0,1-1 0,-1 1 0,1 0 0,-1 0 0,0 0 0,1 0 0,-1 0 0,0 0 0,0 0 0,-1-1 0,1 1 0,0 0 0,-1 0 0,0 2 0,-9-45 0,10 40-1,0 0 0,-1 0-1,1 0 1,0 0 0,0-1-1,0 1 1,0 0 0,0 0 0,0 0-1,0 0 1,0 0 0,0 0-1,1 0 1,-1 0 0,0 0-1,1 0 1,-1 0 0,1 0 0,-1 0-1,1 0 1,-1 0 0,1 0-1,0 0 1,-1 1 0,1-1-1,0 0 1,0 0 0,-1 1-1,1-1 1,0 1 0,0-1 0,0 0-1,0 1 1,0 0 0,0-1-1,0 1 1,0-1 0,0 1-1,0 0 1,2 0 0,15-6-1311,-12 3-5514</inkml:trace>
+  <inkml:trace contextRef="#ctx0" brushRef="#br0" timeOffset="52222.68">2863 839 24575,'-1'-2'0,"-1"-4"0,0-1 0,0 0 0,0 0 0,1 0 0,-1-12 0,2 18 0,0 0 0,0 0 0,0 0 0,0 0 0,0 0 0,0 0 0,1 1 0,-1-1 0,0 0 0,1 0 0,-1 0 0,1 0 0,-1 1 0,1-1 0,-1 0 0,1 0 0,-1 1 0,1-1 0,0 0 0,1 0 0,-1 0 0,1 0 0,0 1 0,-1 0 0,1-1 0,-1 1 0,1 0 0,0 0 0,-1 0 0,1 0 0,0 0 0,-1 0 0,1 0 0,0 0 0,-1 1 0,1-1 0,1 2 0,0-2 0,0 2 0,0-1 0,0 0 0,0 1 0,0-1 0,0 1 0,0 0 0,-1 0 0,1 0 0,-1 0 0,1 1 0,-1-1 0,0 0 0,0 1 0,0 0 0,0-1 0,-1 1 0,3 5 0,-3-7 0,-1 1 0,0-1 0,1 0 0,-1 1 0,0-1 0,0 0 0,0 1 0,0-1 0,0 0 0,0 1 0,0-1 0,0 0 0,-1 1 0,1-1 0,0 0 0,-1 1 0,1-1 0,-2 2 0,1-1 0,-1 0 0,1-1 0,-1 1 0,1-1 0,-1 0 0,1 1 0,-1-1 0,0 0 0,0 0 0,0 0 0,1 0 0,-1 0 0,0-1 0,0 1 0,-4 0 0,4 0 9,0-1 1,1 1-1,-1-1 0,0 0 0,0 1 1,0-1-1,1 0 0,-1 0 0,0-1 0,0 1 1,0 0-1,-2-1 0,3 0-71,0 1 0,0-1 0,0 1 0,1-1 1,-1 0-1,0 0 0,0 1 0,1-1 0,-1 0 0,1 0 0,-1 0 0,1 1 1,-1-1-1,1 0 0,-1 0 0,1 0 0,0 0 0,-1 0 0,1 0 0,0 0 1,0 0-1,0 0 0,0-1 0,-1-7-6764</inkml:trace>
+  <inkml:trace contextRef="#ctx0" brushRef="#br0" timeOffset="53087.95">2980 726 24575,'1'2'0,"1"1"0,-1-1 0,0 1 0,1-1 0,-1 1 0,0-1 0,0 1 0,-1 0 0,1-1 0,-1 1 0,1 5 0,4 11 0,-5-18 0,0 0 0,1 0 0,-1 1 0,0-1 0,1 0 0,-1 0 0,1 0 0,-1 0 0,1 0 0,0 0 0,0 0 0,-1 0 0,1 0 0,0 0 0,0-1 0,0 1 0,0 0 0,0 0 0,0-1 0,0 1 0,0-1 0,0 1 0,0-1 0,0 1 0,0-1 0,1 1 0,-1-1 0,0 0 0,0 0 0,0 0 0,0 0 0,1 0 0,-1 0 0,0 0 0,0 0 0,0 0 0,1-1 0,-1 1 0,0 0 0,0-1 0,1 0 0,1 0 0,0-1 0,-1 0 0,0 0 0,1 0 0,-1-1 0,0 1 0,0 0 0,0-1 0,-1 1 0,1-1 0,-1 0 0,1 1 0,-1-1 0,0 0 0,1-4 0,6-49 0,-4 54 0,3 10 0,11 19 0,-12-17 0,-5-9 0,-1 0 0,0-1 0,1 1 0,-1-1 0,1 1 0,-1 0 0,1-1 0,-1 1 0,1-1 0,-1 1 0,1-1 0,-1 1 0,1-1 0,0 0 0,-1 1 0,1-1 0,-1 0 0,1 1 0,0-1 0,0 0 0,-1 0 0,1 0 0,0 1 0,-1-1 0,1 0 0,0 0 0,0 0 0,-1 0 0,1 0 0,0 0 0,1-1 0,-1 0 0,0 0 0,0 0 0,1 0 0,-1 0 0,0 0 0,0 0 0,0-1 0,0 1 0,0 0 0,-1-1 0,1 1 0,0-1 0,0-1 0,2-6 0,0 1 0,-1-1 0,0 0 0,1-10 0,-1 4-341,-2-1 0,1 0-1,-5-28 1,2 35-6485</inkml:trace>
+  <inkml:trace contextRef="#ctx0" brushRef="#br0" timeOffset="54096.18">3257 609 24575,'2'73'0,"0"-45"0,-2-24 0,1-11 0,-1-3 0,1 0 0,0 0 0,1 0 0,0 0 0,0 0 0,6-13 0,-7 21 0,0 0 0,0-1 0,0 1 0,1 0 0,-1 0 0,1 0 0,0 0 0,-1 0 0,1 0 0,0 0 0,0 1 0,0-1 0,0 1 0,0-1 0,0 1 0,1 0 0,-1 0 0,0 0 0,1 0 0,-1 0 0,1 0 0,-1 1 0,1-1 0,-1 1 0,1-1 0,-1 1 0,1 0 0,0 0 0,-1 1 0,4-1 0,-5 1 0,1-1 0,-1 0 0,1 0 0,-1 1 0,0-1 0,1 0 0,-1 1 0,0-1 0,0 1 0,1 0 0,-1-1 0,0 1 0,0 0 0,0 0 0,0 0 0,0 0 0,0 0 0,0 0 0,0 0 0,0 0 0,0 0 0,0 1 0,-1-1 0,1 0 0,0 3 0,1 1 0,-1 0 0,-1 0 0,1 1 0,-1-1 0,0 10 0,-1-10 0,1-1 0,0 1 0,0 0 0,1 0 0,-1 0 0,1-1 0,0 1 0,3 7 0,7 6-1365,-6-13-5461</inkml:trace>
+</inkml:ink>
+</file>
+
+<file path=word/ink/ink17.xml><?xml version="1.0" encoding="utf-8"?>
+<inkml:ink xmlns:inkml="http://www.w3.org/2003/InkML">
+  <inkml:definitions>
+    <inkml:context xml:id="ctx0">
+      <inkml:inkSource xml:id="inkSrc0">
+        <inkml:traceFormat>
+          <inkml:channel name="X" type="integer" min="-2.14748E9" max="2.14748E9" units="cm"/>
+          <inkml:channel name="Y" type="integer" min="-2.14748E9" max="2.14748E9" units="cm"/>
+          <inkml:channel name="F" type="integer" max="32767" units="dev"/>
+        </inkml:traceFormat>
+        <inkml:channelProperties>
+          <inkml:channelProperty channel="X" name="resolution" value="1000" units="1/cm"/>
+          <inkml:channelProperty channel="Y" name="resolution" value="1000" units="1/cm"/>
+          <inkml:channelProperty channel="F" name="resolution" value="0" units="1/dev"/>
+        </inkml:channelProperties>
+      </inkml:inkSource>
+      <inkml:timestamp xml:id="ts0" timeString="2026-07-14T07:03:33.989"/>
+    </inkml:context>
+    <inkml:brush xml:id="br0">
+      <inkml:brushProperty name="width" value="0.025" units="cm"/>
+      <inkml:brushProperty name="height" value="0.025" units="cm"/>
+      <inkml:brushProperty name="color" value="#FFC114"/>
+    </inkml:brush>
+  </inkml:definitions>
+  <inkml:trace contextRef="#ctx0" brushRef="#br0">0 382 24575,'18'-18'0,"-4"6"0,-1-1 0,-1 0 0,0-1 0,-1-1 0,14-22 0,-17 20 0,7-11 0,21-56 0,-33 76 0,-1 0 0,1 0 0,-2 0 0,1-1 0,-1 1 0,0-1 0,-1 1 0,0-1 0,-1 1 0,0 0 0,0-1 0,-3-9 0,4 17 0,0 1 0,0-1 0,0 1 0,-1 0 0,1-1 0,0 1 0,-1-1 0,1 1 0,0 0 0,-1-1 0,1 1 0,0 0 0,-1-1 0,1 1 0,-1 0 0,1 0 0,0-1 0,-1 1 0,1 0 0,-1 0 0,1 0 0,-1 0 0,1 0 0,-1-1 0,1 1 0,-1 0 0,1 0 0,-1 0 0,1 0 0,-1 0 0,1 1 0,-1-1 0,1 0 0,-1 0 0,1 0 0,-1 0 0,1 0 0,-1 1 0,1-1 0,0 0 0,-1 0 0,1 1 0,-1-1 0,1 0 0,0 1 0,-1-1 0,1 0 0,0 1 0,-1-1 0,1 1 0,0-1 0,-1 1 0,-19 22 0,22-26 11,1 0 0,-1 0 0,1 0 0,0 0 0,0 0 0,0 1-1,0-1 1,0 1 0,0 0 0,5-2 0,-6 3-73,0 1 0,0-1 0,0 1 0,1-1 1,-1 1-1,0 0 0,0-1 0,1 1 0,-1 0 0,0 1 0,0-1 0,1 0 1,-1 1-1,0-1 0,0 1 0,0 0 0,1 0 0,-1-1 0,0 1 0,0 1 1,0-1-1,-1 0 0,3 2 0,14 11-6764</inkml:trace>
+</inkml:ink>
+</file>
+
+<file path=word/ink/ink18.xml><?xml version="1.0" encoding="utf-8"?>
+<inkml:ink xmlns:inkml="http://www.w3.org/2003/InkML">
+  <inkml:definitions>
+    <inkml:context xml:id="ctx0">
+      <inkml:inkSource xml:id="inkSrc0">
+        <inkml:traceFormat>
+          <inkml:channel name="X" type="integer" min="-2.14748E9" max="2.14748E9" units="cm"/>
+          <inkml:channel name="Y" type="integer" min="-2.14748E9" max="2.14748E9" units="cm"/>
+          <inkml:channel name="F" type="integer" max="32767" units="dev"/>
+        </inkml:traceFormat>
+        <inkml:channelProperties>
+          <inkml:channelProperty channel="X" name="resolution" value="1000" units="1/cm"/>
+          <inkml:channelProperty channel="Y" name="resolution" value="1000" units="1/cm"/>
+          <inkml:channelProperty channel="F" name="resolution" value="0" units="1/dev"/>
+        </inkml:channelProperties>
+      </inkml:inkSource>
+      <inkml:timestamp xml:id="ts0" timeString="2026-07-14T07:03:30.895"/>
+    </inkml:context>
+    <inkml:brush xml:id="br0">
+      <inkml:brushProperty name="width" value="0.025" units="cm"/>
+      <inkml:brushProperty name="height" value="0.025" units="cm"/>
+      <inkml:brushProperty name="color" value="#FFC114"/>
+    </inkml:brush>
+  </inkml:definitions>
+  <inkml:trace contextRef="#ctx0" brushRef="#br0">2044 809 24575,'-47'28'0,"0"-3"0,-52 20 0,34-16 0,42-21 0,0 0 0,-1-2 0,1-1 0,-1 0 0,-46 1 0,32-3 0,-47 11 0,19 3 0,34-8 0,-1-1 0,0-2 0,-55 5 0,-367-12 0,417-2 0,0-1 0,0-2 0,1-2 0,0-1 0,-37-15 0,-75-17 0,99 29 0,-67-23 0,92 25 0,0 0 0,1-2 0,0 0 0,-31-24 0,51 34 0,1-1 0,0 0 0,1 0 0,-1 0 0,0 0 0,1 0 0,0-1 0,0 1 0,0-1 0,0 0 0,0 0 0,1 1 0,0-1 0,-1 0 0,2 0 0,-1 0 0,0-5 0,0-8 0,1 1 0,0-1 0,3-17 0,1-14 0,-4 24 0,5-95 0,-3 105 0,1-1 0,0 1 0,1 0 0,1 0 0,0 0 0,7-15 0,11-12 0,2 1 0,36-46 0,-56 80 0,1 1 0,-1-1 0,1 1 0,0 1 0,0-1 0,1 1 0,11-6 0,53-19 0,-50 21 0,17-4 0,0 2 0,1 2 0,55-6 0,-43 7 0,54-14 0,-82 15 0,7-3 0,1 1 0,0 2 0,0 1 0,40-2 0,5 7 0,447 2 0,-467 2 0,1 3 0,0 2 0,-2 2 0,1 3 0,-1 2 0,-2 3 0,1 2 0,85 47 0,-122-58 0,0 0 0,0 1 0,-1 1 0,-1 0 0,0 1 0,-1 1 0,17 20 0,-24-25 0,-1 1 0,0-1 0,0 1 0,-1 0 0,0 1 0,-1-1 0,0 1 0,-1 0 0,0 0 0,0 0 0,-2 1 0,1-1 0,-1 1 0,-1 10 0,1 57 0,0-37 0,-6 52 0,4-90 0,0 1 0,0 0 0,-1 0 0,0-1 0,0 1 0,0-1 0,-1 1 0,1-1 0,-1 0 0,0 0 0,0 0 0,-1-1 0,1 1 0,-1-1 0,1 1 0,-1-1 0,-8 4 0,-9 6 0,1-2 0,-36 14 0,16-8 0,26-10-170,0 0-1,0-1 0,0 0 1,-1-2-1,0 1 0,0-2 1,-30 4-1,33-7-6655</inkml:trace>
+</inkml:ink>
+</file>
+
+<file path=word/ink/ink19.xml><?xml version="1.0" encoding="utf-8"?>
+<inkml:ink xmlns:inkml="http://www.w3.org/2003/InkML">
+  <inkml:definitions>
+    <inkml:context xml:id="ctx0">
+      <inkml:inkSource xml:id="inkSrc0">
+        <inkml:traceFormat>
+          <inkml:channel name="X" type="integer" min="-2.14748E9" max="2.14748E9" units="cm"/>
+          <inkml:channel name="Y" type="integer" min="-2.14748E9" max="2.14748E9" units="cm"/>
+          <inkml:channel name="F" type="integer" max="32767" units="dev"/>
+        </inkml:traceFormat>
+        <inkml:channelProperties>
+          <inkml:channelProperty channel="X" name="resolution" value="1000" units="1/cm"/>
+          <inkml:channelProperty channel="Y" name="resolution" value="1000" units="1/cm"/>
+          <inkml:channelProperty channel="F" name="resolution" value="0" units="1/dev"/>
+        </inkml:channelProperties>
+      </inkml:inkSource>
+      <inkml:timestamp xml:id="ts0" timeString="2026-07-14T06:59:54.257"/>
+    </inkml:context>
+    <inkml:brush xml:id="br0">
+      <inkml:brushProperty name="width" value="0.025" units="cm"/>
+      <inkml:brushProperty name="height" value="0.025" units="cm"/>
+      <inkml:brushProperty name="color" value="#E71224"/>
+    </inkml:brush>
+  </inkml:definitions>
+  <inkml:trace contextRef="#ctx0" brushRef="#br0">6 74 24575,'-2'4'0,"1"0"0,0 0 0,1 0 0,-1 0 0,1 0 0,-1 0 0,1 0 0,1 0 0,-1 1 0,0-1 0,1 0 0,0 0 0,1 5 0,0-3 0,0 1 0,1-1 0,-1 0 0,1 0 0,0 0 0,0 0 0,6 7 0,-8-12 0,0 0 0,-1 0 0,1 0 0,0-1 0,0 1 0,1 0 0,-1 0 0,0 0 0,0-1 0,0 1 0,0-1 0,1 1 0,-1-1 0,0 1 0,1-1 0,-1 0 0,0 0 0,1 1 0,-1-1 0,0 0 0,1 0 0,-1 0 0,0-1 0,1 1 0,-1 0 0,0 0 0,1-1 0,-1 1 0,0-1 0,0 1 0,1-1 0,-1 1 0,0-1 0,0 0 0,0 0 0,0 1 0,0-1 0,0 0 0,0 0 0,1-1 0,6-6 0,-1-1 0,0 1 0,12-20 0,-9 14 0,30-32 64,-29 36-421,-1-1-1,-1 0 1,15-23 0,-17 21-6469</inkml:trace>
+</inkml:ink>
+</file>
+
 <file path=word/ink/ink2.xml><?xml version="1.0" encoding="utf-8"?>
 <inkml:ink xmlns:inkml="http://www.w3.org/2003/InkML">
   <inkml:definitions>
@@ -7832,6 +9940,231 @@
   <inkml:trace contextRef="#ctx0" brushRef="#br0" timeOffset="6389.16">1043 572 24575,'-7'93'0,"9"-75"0,-1-18 0,-1 0 0,0 0 0,0 0 0,1 0 0,-1 0 0,0 0 0,1 0 0,-1 0 0,0 0 0,1 0 0,-1 0 0,0 0 0,1 0 0,-1 0 0,0 0 0,0 0 0,1-1 0,-1 1 0,0 0 0,0 0 0,1 0 0,-1 0 0,0-1 0,0 1 0,1 0 0,-1 0 0,0 0 0,0-1 0,0 1 0,1 0 0,-1-1 0,2-1 0,0-1 0,0 1 0,-1-1 0,1 1 0,-1-1 0,1 0 0,-1 0 0,0 0 0,1-3 0,-1-29 0,-1 19 0,0 14 0,1 5 0,1 1 0,-1 0 0,0 0 0,1 0 0,0 0 0,0 0 0,0-1 0,0 1 0,1-1 0,-1 1 0,1-1 0,5 5 0,-8-8 0,1 1 0,0 0 0,0-1 0,0 1 0,0-1 0,0 1 0,0-1 0,0 0 0,0 1 0,0-1 0,0 0 0,0 0 0,0 1 0,0-1 0,0 0 0,0 0 0,0 0 0,0 0 0,0 0 0,1-1 0,0 0 0,-1 1 0,0-1 0,1 0 0,-1 0 0,1 0 0,-1 0 0,0 0 0,0 0 0,1-1 0,-1 1 0,0 0 0,0-1 0,0 1 0,-1 0 0,1-1 0,1-2 0,4-10-1365,-2 0-5461</inkml:trace>
   <inkml:trace contextRef="#ctx0" brushRef="#br0" timeOffset="6808.35">1148 382 24575,'2'5'0,"2"6"0,5 5 0,3 4 0,1 6 0,2 2 0,-1 0 0,-1-3 0,-3-1 0,0-1 0,1-1 0,-2-2 0,-3-4-8191</inkml:trace>
   <inkml:trace contextRef="#ctx0" brushRef="#br0" timeOffset="7321.85">1221 346 24575,'1'3'0,"2"4"0,2 5 0,3 3 0,1 0 0,1 2 0,0 2 0,2 1 0,1 2 0,-1 2 0,-2-2 0,-3-4 0,-2-2 0,-3-3 0,-1-4-8191</inkml:trace>
+</inkml:ink>
+</file>
+
+<file path=word/ink/ink20.xml><?xml version="1.0" encoding="utf-8"?>
+<inkml:ink xmlns:inkml="http://www.w3.org/2003/InkML">
+  <inkml:definitions>
+    <inkml:context xml:id="ctx0">
+      <inkml:inkSource xml:id="inkSrc0">
+        <inkml:traceFormat>
+          <inkml:channel name="X" type="integer" min="-2.14748E9" max="2.14748E9" units="cm"/>
+          <inkml:channel name="Y" type="integer" min="-2.14748E9" max="2.14748E9" units="cm"/>
+          <inkml:channel name="F" type="integer" max="32767" units="dev"/>
+        </inkml:traceFormat>
+        <inkml:channelProperties>
+          <inkml:channelProperty channel="X" name="resolution" value="1000" units="1/cm"/>
+          <inkml:channelProperty channel="Y" name="resolution" value="1000" units="1/cm"/>
+          <inkml:channelProperty channel="F" name="resolution" value="0" units="1/dev"/>
+        </inkml:channelProperties>
+      </inkml:inkSource>
+      <inkml:timestamp xml:id="ts0" timeString="2026-07-14T06:59:53.081"/>
+    </inkml:context>
+    <inkml:brush xml:id="br0">
+      <inkml:brushProperty name="width" value="0.025" units="cm"/>
+      <inkml:brushProperty name="height" value="0.025" units="cm"/>
+      <inkml:brushProperty name="color" value="#E71224"/>
+    </inkml:brush>
+  </inkml:definitions>
+  <inkml:trace contextRef="#ctx0" brushRef="#br0">1 218 24575,'9'24'0,"1"0"0,14 21 0,-15-29 0,-8-14 0,-1-1 0,1 0 0,-1 1 0,1-1 0,0 0 0,0 0 0,0 0 0,0 1 0,0-1 0,0 0 0,0 0 0,0 0 0,0-1 0,0 1 0,0 0 0,1 0 0,-1-1 0,0 1 0,0-1 0,1 1 0,1 0 0,-2-1 0,1 0 0,-1-1 0,1 1 0,-1 0 0,0-1 0,1 1 0,-1-1 0,0 1 0,0-1 0,1 0 0,-1 1 0,0-1 0,0 0 0,0 0 0,0 0 0,0 0 0,2-2 0,4-6 0,0 0 0,-1-1 0,0 0 0,6-14 0,-8 15 0,109-233-1365,-101 220-5461</inkml:trace>
+</inkml:ink>
+</file>
+
+<file path=word/ink/ink21.xml><?xml version="1.0" encoding="utf-8"?>
+<inkml:ink xmlns:inkml="http://www.w3.org/2003/InkML">
+  <inkml:definitions>
+    <inkml:context xml:id="ctx0">
+      <inkml:inkSource xml:id="inkSrc0">
+        <inkml:traceFormat>
+          <inkml:channel name="X" type="integer" min="-2.14748E9" max="2.14748E9" units="cm"/>
+          <inkml:channel name="Y" type="integer" min="-2.14748E9" max="2.14748E9" units="cm"/>
+          <inkml:channel name="F" type="integer" max="32767" units="dev"/>
+        </inkml:traceFormat>
+        <inkml:channelProperties>
+          <inkml:channelProperty channel="X" name="resolution" value="1000" units="1/cm"/>
+          <inkml:channelProperty channel="Y" name="resolution" value="1000" units="1/cm"/>
+          <inkml:channelProperty channel="F" name="resolution" value="0" units="1/dev"/>
+        </inkml:channelProperties>
+      </inkml:inkSource>
+      <inkml:timestamp xml:id="ts0" timeString="2026-07-14T06:59:52.039"/>
+    </inkml:context>
+    <inkml:brush xml:id="br0">
+      <inkml:brushProperty name="width" value="0.025" units="cm"/>
+      <inkml:brushProperty name="height" value="0.025" units="cm"/>
+      <inkml:brushProperty name="color" value="#E71224"/>
+    </inkml:brush>
+  </inkml:definitions>
+  <inkml:trace contextRef="#ctx0" brushRef="#br0">1 64 24575,'6'25'0,"7"48"0,1 2 0,-14-73 0,0-1 0,1 1 0,-1 0 0,1-1 0,-1 1 0,1-1 0,0 1 0,-1 0 0,1-1 0,0 0 0,0 1 0,0-1 0,0 1 0,0-1 0,1 0 0,-1 0 0,0 0 0,2 2 0,-1-3 0,-1 0 0,0 1 0,0-1 0,0 0 0,0 0 0,0 0 0,0 0 0,0 0 0,0 0 0,0 0 0,1-1 0,-1 1 0,0 0 0,0 0 0,0-1 0,0 1 0,0-1 0,0 1 0,0-1 0,1-1 0,4-2 0,-1-1 0,0 0 0,0 0 0,0 0 0,0 0 0,-1-1 0,4-7 0,27-45-682,62-79-1,-82 120-6143</inkml:trace>
+</inkml:ink>
+</file>
+
+<file path=word/ink/ink22.xml><?xml version="1.0" encoding="utf-8"?>
+<inkml:ink xmlns:inkml="http://www.w3.org/2003/InkML">
+  <inkml:definitions>
+    <inkml:context xml:id="ctx0">
+      <inkml:inkSource xml:id="inkSrc0">
+        <inkml:traceFormat>
+          <inkml:channel name="X" type="integer" min="-2.14748E9" max="2.14748E9" units="cm"/>
+          <inkml:channel name="Y" type="integer" min="-2.14748E9" max="2.14748E9" units="cm"/>
+          <inkml:channel name="F" type="integer" max="32767" units="dev"/>
+        </inkml:traceFormat>
+        <inkml:channelProperties>
+          <inkml:channelProperty channel="X" name="resolution" value="1000" units="1/cm"/>
+          <inkml:channelProperty channel="Y" name="resolution" value="1000" units="1/cm"/>
+          <inkml:channelProperty channel="F" name="resolution" value="0" units="1/dev"/>
+        </inkml:channelProperties>
+      </inkml:inkSource>
+      <inkml:timestamp xml:id="ts0" timeString="2026-07-14T06:59:47.541"/>
+    </inkml:context>
+    <inkml:brush xml:id="br0">
+      <inkml:brushProperty name="width" value="0.025" units="cm"/>
+      <inkml:brushProperty name="height" value="0.025" units="cm"/>
+      <inkml:brushProperty name="color" value="#E71224"/>
+    </inkml:brush>
+  </inkml:definitions>
+  <inkml:trace contextRef="#ctx0" brushRef="#br0">111 0 24575,'2'4'0,"0"2"0,-5 4 0,-2 2 0,-3 2 0,-3 5 0,1-1 0,-1 3 0,-1 1 0,-2-1 0,1-2 0,1-3-8191</inkml:trace>
+  <inkml:trace contextRef="#ctx0" brushRef="#br0" timeOffset="955.18">0 61 24575,'4'-2'0,"2"0"0,4 0 0,6 0 0,1 4 0,1 4 0,0 2 0,-2 3 0,0 0 0,-1 0 0,-3 1 0,0 0 0,-1 2 0,-2-1-8191</inkml:trace>
+</inkml:ink>
+</file>
+
+<file path=word/ink/ink23.xml><?xml version="1.0" encoding="utf-8"?>
+<inkml:ink xmlns:inkml="http://www.w3.org/2003/InkML">
+  <inkml:definitions>
+    <inkml:context xml:id="ctx0">
+      <inkml:inkSource xml:id="inkSrc0">
+        <inkml:traceFormat>
+          <inkml:channel name="X" type="integer" min="-2.14748E9" max="2.14748E9" units="cm"/>
+          <inkml:channel name="Y" type="integer" min="-2.14748E9" max="2.14748E9" units="cm"/>
+          <inkml:channel name="F" type="integer" max="32767" units="dev"/>
+        </inkml:traceFormat>
+        <inkml:channelProperties>
+          <inkml:channelProperty channel="X" name="resolution" value="1000" units="1/cm"/>
+          <inkml:channelProperty channel="Y" name="resolution" value="1000" units="1/cm"/>
+          <inkml:channelProperty channel="F" name="resolution" value="0" units="1/dev"/>
+        </inkml:channelProperties>
+      </inkml:inkSource>
+      <inkml:timestamp xml:id="ts0" timeString="2026-07-14T06:59:44.344"/>
+    </inkml:context>
+    <inkml:brush xml:id="br0">
+      <inkml:brushProperty name="width" value="0.025" units="cm"/>
+      <inkml:brushProperty name="height" value="0.025" units="cm"/>
+      <inkml:brushProperty name="color" value="#E71224"/>
+    </inkml:brush>
+  </inkml:definitions>
+  <inkml:trace contextRef="#ctx0" brushRef="#br0">1015 230 24497,'0'9'0,"-2"0"0,0 0 0,0 0 0,-2 0 0,0 0 0,-1 0 0,-1 0 0,0-1 0,-2 1 0,0-1 0,0 0 0,-2 0 0,0 0 0,0-1 0,-2 1 0,0-1 0,-1 0 0,0 0 0,-1-1 0,0 1 0,-1-1 0,0-1 0,-1 1 0,0-1 0,-1 0 0,0-1 0,-1 1 0,0-1 0,0-1 0,-1 1 0,1-1 0,-2-1 0,1 0 0,0 0 0,-1 0 0,0-1 0,1 0 0,-1 0 0,0-1 0,0 0 0,0-1 0,0 0 0,0 0 0,1-1 0,-1 0 0,1 0 0,0 0 0,0-1 0,1-1 0,-1 1 0,2-1 0,-1-1 0,1 1 0,0-1 0,1 0 0,0-1 0,0 1 0,2-1 0,-1-1 0,1 1 0,1-1 0,0 0 0,1 0 0,1-1 0,0 1 0,1-1 0,1 0 0,0 0 0,1 0 0,1-1 0,0 1 0,2-1 0,0 0 0,0 0 0,2 0 0,0 0 0,1 0 0,1 0 0,1 0 0,0 0 0,1 0 0,1 0 0,1 0 0,0 0 0,2 1 0,0-1 0,0 0 0,2 1 0,0-1 0,1 1 0,1 0 0,0 0 0,1 0 0,1 0 0,0 1 0,1 0 0,1 0 0,0 0 0,1 0 0,1 1 0,-1 0 0,2 0 0,0 1 0,0 0 0,1 0 0,0 0 0,1 1 0,-1 0 0,2 1 0,-1-1 0,1 1 0,0 1 0,0-1 0,1 1 0,-1 1 0,1 0 0,0 0 0,0 0 0,0 1 0,0 0 0,0 1 0,-1 0 0,1 0 0,0 0 0,-1 1 0,0 1 0,1-1 0,-2 1 0,1 1 0,-1-1 0,0 1 0,0 0 0,-1 1 0,0 0 0,-1 0 0,0 0 0,-1 1 0,0 0 0,-1 0 0,0 1 0,-1 0 0,0 0 0,-1 0 0,0 0 0,-2 1 0,0 0 0,0 0 0,-2 0 0,0 0 0,0 1 0,-2-1 0,0 1 0,-1 0 0,-1-1 0,0 1 0,-2 0 0,0 0 0,0 0 0,-2 0 0</inkml:trace>
+</inkml:ink>
+</file>
+
+<file path=word/ink/ink24.xml><?xml version="1.0" encoding="utf-8"?>
+<inkml:ink xmlns:inkml="http://www.w3.org/2003/InkML">
+  <inkml:definitions>
+    <inkml:context xml:id="ctx0">
+      <inkml:inkSource xml:id="inkSrc0">
+        <inkml:traceFormat>
+          <inkml:channel name="X" type="integer" min="-2.14748E9" max="2.14748E9" units="cm"/>
+          <inkml:channel name="Y" type="integer" min="-2.14748E9" max="2.14748E9" units="cm"/>
+          <inkml:channel name="F" type="integer" max="32767" units="dev"/>
+        </inkml:traceFormat>
+        <inkml:channelProperties>
+          <inkml:channelProperty channel="X" name="resolution" value="1000" units="1/cm"/>
+          <inkml:channelProperty channel="Y" name="resolution" value="1000" units="1/cm"/>
+          <inkml:channelProperty channel="F" name="resolution" value="0" units="1/dev"/>
+        </inkml:channelProperties>
+      </inkml:inkSource>
+      <inkml:timestamp xml:id="ts0" timeString="2026-07-14T06:59:39.338"/>
+    </inkml:context>
+    <inkml:brush xml:id="br0">
+      <inkml:brushProperty name="width" value="0.025" units="cm"/>
+      <inkml:brushProperty name="height" value="0.025" units="cm"/>
+      <inkml:brushProperty name="color" value="#E71224"/>
+    </inkml:brush>
+  </inkml:definitions>
+  <inkml:trace contextRef="#ctx0" brushRef="#br0">1 7 24575,'2'-4'0,"3"2"0,4 5 0,2 4 0,3 6 0,1 4 0,0 5 0,-3 0 0,-2-1 0,-4-3-8191</inkml:trace>
+</inkml:ink>
+</file>
+
+<file path=word/ink/ink25.xml><?xml version="1.0" encoding="utf-8"?>
+<inkml:ink xmlns:inkml="http://www.w3.org/2003/InkML">
+  <inkml:definitions>
+    <inkml:context xml:id="ctx0">
+      <inkml:inkSource xml:id="inkSrc0">
+        <inkml:traceFormat>
+          <inkml:channel name="X" type="integer" min="-2.14748E9" max="2.14748E9" units="cm"/>
+          <inkml:channel name="Y" type="integer" min="-2.14748E9" max="2.14748E9" units="cm"/>
+          <inkml:channel name="F" type="integer" max="32767" units="dev"/>
+        </inkml:traceFormat>
+        <inkml:channelProperties>
+          <inkml:channelProperty channel="X" name="resolution" value="1000" units="1/cm"/>
+          <inkml:channelProperty channel="Y" name="resolution" value="1000" units="1/cm"/>
+          <inkml:channelProperty channel="F" name="resolution" value="0" units="1/dev"/>
+        </inkml:channelProperties>
+      </inkml:inkSource>
+      <inkml:timestamp xml:id="ts0" timeString="2026-07-14T06:59:34.432"/>
+    </inkml:context>
+    <inkml:brush xml:id="br0">
+      <inkml:brushProperty name="width" value="0.025" units="cm"/>
+      <inkml:brushProperty name="height" value="0.025" units="cm"/>
+      <inkml:brushProperty name="color" value="#E71224"/>
+    </inkml:brush>
+  </inkml:definitions>
+  <inkml:trace contextRef="#ctx0" brushRef="#br0">57 1 24575,'0'2'0,"-3"3"0,-3 4 0,-1 1 0,1 2 0,-1 2 0,-2 1 0,-1 0 0,1-3-8191</inkml:trace>
+</inkml:ink>
+</file>
+
+<file path=word/ink/ink26.xml><?xml version="1.0" encoding="utf-8"?>
+<inkml:ink xmlns:inkml="http://www.w3.org/2003/InkML">
+  <inkml:definitions>
+    <inkml:context xml:id="ctx0">
+      <inkml:inkSource xml:id="inkSrc0">
+        <inkml:traceFormat>
+          <inkml:channel name="X" type="integer" min="-2.14748E9" max="2.14748E9" units="cm"/>
+          <inkml:channel name="Y" type="integer" min="-2.14748E9" max="2.14748E9" units="cm"/>
+          <inkml:channel name="F" type="integer" max="32767" units="dev"/>
+        </inkml:traceFormat>
+        <inkml:channelProperties>
+          <inkml:channelProperty channel="X" name="resolution" value="1000" units="1/cm"/>
+          <inkml:channelProperty channel="Y" name="resolution" value="1000" units="1/cm"/>
+          <inkml:channelProperty channel="F" name="resolution" value="0" units="1/dev"/>
+        </inkml:channelProperties>
+      </inkml:inkSource>
+      <inkml:timestamp xml:id="ts0" timeString="2026-07-14T06:59:30.222"/>
+    </inkml:context>
+    <inkml:brush xml:id="br0">
+      <inkml:brushProperty name="width" value="0.025" units="cm"/>
+      <inkml:brushProperty name="height" value="0.025" units="cm"/>
+      <inkml:brushProperty name="color" value="#E71224"/>
+    </inkml:brush>
+  </inkml:definitions>
+  <inkml:trace contextRef="#ctx0" brushRef="#br0">958 407 24575,'-7'1'0,"0"0"0,1 1 0,-1 0 0,1 0 0,-1 0 0,1 1 0,0 0 0,0 1 0,-8 5 0,-30 13 0,0-6 0,0-2 0,-1-3 0,-1-1 0,0-2 0,-78 3 0,65-10 0,18 0 0,-51-6 0,79 4 0,1-1 0,-1-1 0,1 0 0,-1-1 0,1 0 0,0-1 0,0-1 0,-13-7 0,7 1 0,1-1 0,0 0 0,0-1 0,-22-26 0,31 31 0,0-1 0,1 0 0,0 0 0,1-1 0,0 0 0,0 0 0,1 0 0,1-1 0,-6-18 0,9 22 0,1 1 0,-1 0 0,1 0 0,0-1 0,1 1 0,0 0 0,0 0 0,0 0 0,1-1 0,0 2 0,1-1 0,-1 0 0,1 0 0,1 1 0,-1-1 0,1 1 0,0 0 0,7-8 0,-2 4 0,0 0 0,0 1 0,1 0 0,0 1 0,1 0 0,0 1 0,0 0 0,0 0 0,18-6 0,-3 4 0,0 1 0,1 1 0,-1 1 0,1 2 0,35-2 0,140 7 0,-84 1 0,144-2 0,-257 1 0,1 0 0,-1-1 0,1 2 0,-1-1 0,0 1 0,0-1 0,0 2 0,0-1 0,0 0 0,0 1 0,0 0 0,-1 0 0,1 0 0,-1 1 0,0 0 0,0 0 0,0 0 0,-1 0 0,1 0 0,-1 1 0,0-1 0,4 10 0,4 7 0,-2 0 0,0 1 0,11 43 0,-18-56 7,-1-1 0,0 0-1,0 0 1,-1 1 0,0-1-1,-1 0 1,0 1-1,0-1 1,0 0 0,-1 0-1,0 0 1,-1 0 0,0 0-1,0 0 1,-1-1 0,0 1-1,-9 12 1,3-6-172,0-1 0,-1-1 0,-1 0 0,0 0 0,0-1 0,-1-1 0,-1 0 0,-15 9 0,13-10-6661</inkml:trace>
+</inkml:ink>
+</file>
+
+<file path=word/ink/ink27.xml><?xml version="1.0" encoding="utf-8"?>
+<inkml:ink xmlns:inkml="http://www.w3.org/2003/InkML">
+  <inkml:definitions>
+    <inkml:context xml:id="ctx0">
+      <inkml:inkSource xml:id="inkSrc0">
+        <inkml:traceFormat>
+          <inkml:channel name="X" type="integer" min="-2.14748E9" max="2.14748E9" units="cm"/>
+          <inkml:channel name="Y" type="integer" min="-2.14748E9" max="2.14748E9" units="cm"/>
+          <inkml:channel name="F" type="integer" max="32767" units="dev"/>
+        </inkml:traceFormat>
+        <inkml:channelProperties>
+          <inkml:channelProperty channel="X" name="resolution" value="1000" units="1/cm"/>
+          <inkml:channelProperty channel="Y" name="resolution" value="1000" units="1/cm"/>
+          <inkml:channelProperty channel="F" name="resolution" value="0" units="1/dev"/>
+        </inkml:channelProperties>
+      </inkml:inkSource>
+      <inkml:timestamp xml:id="ts0" timeString="2026-07-14T08:28:56.413"/>
+    </inkml:context>
+    <inkml:brush xml:id="br0">
+      <inkml:brushProperty name="width" value="0.025" units="cm"/>
+      <inkml:brushProperty name="height" value="0.025" units="cm"/>
+      <inkml:brushProperty name="color" value="#FFC114"/>
+    </inkml:brush>
+  </inkml:definitions>
+  <inkml:trace contextRef="#ctx0" brushRef="#br0">498 4037 24575,'-2'-20'0,"-1"0"0,0-1 0,-2 1 0,0 1 0,-2-1 0,-9-21 0,4 9 0,-93-243 0,-103-318 0,171 449 0,5-1 0,7-2 0,-10-247 0,32 264 0,20-174 0,-10 248 0,3-1 0,2 2 0,3 0 0,2 0 0,38-81 0,-16 57 0,4 3 0,3 1 0,107-132 0,-112 162 0,1 0 0,2 3 0,3 2 0,0 2 0,3 2 0,80-45 0,238-84 0,-260 120 0,58-19 0,341-82 0,-458 135 0,246-53 0,-196 47 0,102-3 0,136 18 0,-269 7 0,-1 3 0,-1 2 0,67 21 0,807 308 0,-500-129 0,-361-165 0,-3 4 0,-3 3 0,95 84 0,-69-39 0,-4 4 0,-4 4 0,108 163 0,-155-196 0,-2 1 0,61 157 0,27 169 0,-108-308 0,-4 1 0,-4 0 0,3 136 0,-24 282 0,6-499 0,-2 53 0,-3 0 0,-15 62 0,13-90 0,-2 0 0,-1-1 0,-3 0 0,-31 60 0,19-49 0,-3-1 0,-1-1 0,-3-2 0,-1-2 0,-1-1 0,-3-1 0,-1-2 0,-1-2 0,-2-2 0,-2-1 0,-70 36 0,-212 85 0,259-122 0,-196 74 0,98-41 0,42-14 0,-264 100 0,275-112 0,-176 35 0,219-62 0,-117 3 0,-71-16 0,81-1 0,-136-7 0,228 3 0,-142-32 0,-210-46 0,397 80 0,0-2 0,1-1 0,0-3 0,1-1 0,-53-25 0,-173-83 0,212 101 0,10 5 0,1-3 0,-65-37 0,72 34 0,10 4 0,-2 1 0,1 2 0,-2 0 0,0 2 0,-44-14 0,52 19 0,1 0 0,-1-1 0,2 0 0,-1-1 0,1-1 0,-18-15 0,-33-19 0,52 36 0,-1-1 0,1 0 0,1-1 0,0 0 0,0-2 0,1 1 0,0-2 0,1 0 0,1 0 0,-19-28 0,-6-18-455,-1 2 0,-61-69 0,77 100-6371</inkml:trace>
 </inkml:ink>
 </file>
 

</xml_diff>